<commit_message>
Perbaiki template dan api sirup
</commit_message>
<xml_diff>
--- a/Master Folder/Master BA Timlak Fisik/01. BA Reviu HPS melalui SIPASTI.docx
+++ b/Master Folder/Master BA Timlak Fisik/01. BA Reviu HPS melalui SIPASTI.docx
@@ -1,6 +1,6 @@
 
 <file path=word/document.xml><?xml version="1.0" encoding="utf-8"?>
-<w:document xmlns:wpc="http://schemas.microsoft.com/office/word/2010/wordprocessingCanvas" xmlns:cx="http://schemas.microsoft.com/office/drawing/2014/chartex" xmlns:cx1="http://schemas.microsoft.com/office/drawing/2015/9/8/chartex" xmlns:cx2="http://schemas.microsoft.com/office/drawing/2015/10/21/chartex" xmlns:cx3="http://schemas.microsoft.com/office/drawing/2016/5/9/chartex" xmlns:cx4="http://schemas.microsoft.com/office/drawing/2016/5/10/chartex" xmlns:cx5="http://schemas.microsoft.com/office/drawing/2016/5/11/chartex" xmlns:cx6="http://schemas.microsoft.com/office/drawing/2016/5/12/chartex" xmlns:cx7="http://schemas.microsoft.com/office/drawing/2016/5/13/chartex" xmlns:cx8="http://schemas.microsoft.com/office/drawing/2016/5/14/chartex" xmlns:mc="http://schemas.openxmlformats.org/markup-compatibility/2006" xmlns:aink="http://schemas.microsoft.com/office/drawing/2016/ink" xmlns:am3d="http://schemas.microsoft.com/office/drawing/2017/model3d" xmlns:o="urn:schemas-microsoft-com:office:office" xmlns:oel="http://schemas.microsoft.com/office/2019/extlst" xmlns:r="http://schemas.openxmlformats.org/officeDocument/2006/relationships" xmlns:m="http://schemas.openxmlformats.org/officeDocument/2006/math" xmlns:v="urn:schemas-microsoft-com:vml" xmlns:wp14="http://schemas.microsoft.com/office/word/2010/wordprocessingDrawing" xmlns:wp="http://schemas.openxmlformats.org/drawingml/2006/wordprocessingDrawing" xmlns:w10="urn:schemas-microsoft-com:office:word" xmlns:w="http://schemas.openxmlformats.org/wordprocessingml/2006/main" xmlns:w14="http://schemas.microsoft.com/office/word/2010/wordml" xmlns:w15="http://schemas.microsoft.com/office/word/2012/wordml" xmlns:w16cex="http://schemas.microsoft.com/office/word/2018/wordml/cex" xmlns:w16cid="http://schemas.microsoft.com/office/word/2016/wordml/cid" xmlns:w16="http://schemas.microsoft.com/office/word/2018/wordml" xmlns:w16du="http://schemas.microsoft.com/office/word/2023/wordml/word16du" xmlns:w16sdtdh="http://schemas.microsoft.com/office/word/2020/wordml/sdtdatahash" xmlns:w16sdtfl="http://schemas.microsoft.com/office/word/2024/wordml/sdtformatlock" xmlns:w16se="http://schemas.microsoft.com/office/word/2015/wordml/symex" xmlns:wpg="http://schemas.microsoft.com/office/word/2010/wordprocessingGroup" xmlns:wpi="http://schemas.microsoft.com/office/word/2010/wordprocessingInk" xmlns:wne="http://schemas.microsoft.com/office/word/2006/wordml" xmlns:wps="http://schemas.microsoft.com/office/word/2010/wordprocessingShape" mc:Ignorable="w14 w15 w16se w16cid w16 w16cex w16sdtdh w16sdtfl w16du wp14">
+<w:document xmlns:wpc="http://schemas.microsoft.com/office/word/2010/wordprocessingCanvas" xmlns:cx="http://schemas.microsoft.com/office/drawing/2014/chartex" xmlns:cx1="http://schemas.microsoft.com/office/drawing/2015/9/8/chartex" xmlns:cx2="http://schemas.microsoft.com/office/drawing/2015/10/21/chartex" xmlns:cx3="http://schemas.microsoft.com/office/drawing/2016/5/9/chartex" xmlns:cx4="http://schemas.microsoft.com/office/drawing/2016/5/10/chartex" xmlns:cx5="http://schemas.microsoft.com/office/drawing/2016/5/11/chartex" xmlns:cx6="http://schemas.microsoft.com/office/drawing/2016/5/12/chartex" xmlns:cx7="http://schemas.microsoft.com/office/drawing/2016/5/13/chartex" xmlns:cx8="http://schemas.microsoft.com/office/drawing/2016/5/14/chartex" xmlns:mc="http://schemas.openxmlformats.org/markup-compatibility/2006" xmlns:aink="http://schemas.microsoft.com/office/drawing/2016/ink" xmlns:am3d="http://schemas.microsoft.com/office/drawing/2017/model3d" xmlns:o="urn:schemas-microsoft-com:office:office" xmlns:r="http://schemas.openxmlformats.org/officeDocument/2006/relationships" xmlns:m="http://schemas.openxmlformats.org/officeDocument/2006/math" xmlns:v="urn:schemas-microsoft-com:vml" xmlns:wp14="http://schemas.microsoft.com/office/word/2010/wordprocessingDrawing" xmlns:wp="http://schemas.openxmlformats.org/drawingml/2006/wordprocessingDrawing" xmlns:w10="urn:schemas-microsoft-com:office:word" xmlns:w="http://schemas.openxmlformats.org/wordprocessingml/2006/main" xmlns:w14="http://schemas.microsoft.com/office/word/2010/wordml" xmlns:w15="http://schemas.microsoft.com/office/word/2012/wordml" xmlns:w16cex="http://schemas.microsoft.com/office/word/2018/wordml/cex" xmlns:w16cid="http://schemas.microsoft.com/office/word/2016/wordml/cid" xmlns:w16="http://schemas.microsoft.com/office/word/2018/wordml" xmlns:w16sdtdh="http://schemas.microsoft.com/office/word/2020/wordml/sdtdatahash" xmlns:w16se="http://schemas.microsoft.com/office/word/2015/wordml/symex" xmlns:wpg="http://schemas.microsoft.com/office/word/2010/wordprocessingGroup" xmlns:wpi="http://schemas.microsoft.com/office/word/2010/wordprocessingInk" xmlns:wne="http://schemas.microsoft.com/office/word/2006/wordml" xmlns:wps="http://schemas.microsoft.com/office/word/2010/wordprocessingShape" mc:Ignorable="w14 w15 w16se w16cid w16 w16cex w16sdtdh wp14">
   <w:body>
     <w:p>
       <w:pPr>
@@ -471,8 +471,9 @@
           <w:szCs w:val="22"/>
           <w:lang w:val="en-US"/>
         </w:rPr>
-        <w:t>_reviu</w:t>
-      </w:r>
+        <w:t>_</w:t>
+      </w:r>
+      <w:proofErr w:type="spellStart"/>
       <w:r>
         <w:rPr>
           <w:rFonts w:ascii="Arial" w:eastAsia="Arial" w:hAnsi="Arial" w:cs="Arial"/>
@@ -482,9 +483,11 @@
           <w:spacing w:val="7"/>
           <w:sz w:val="22"/>
           <w:szCs w:val="22"/>
-        </w:rPr>
-        <w:t>}</w:t>
-      </w:r>
+          <w:lang w:val="en-US"/>
+        </w:rPr>
+        <w:t>reviu</w:t>
+      </w:r>
+      <w:proofErr w:type="spellEnd"/>
       <w:r>
         <w:rPr>
           <w:rFonts w:ascii="Arial" w:eastAsia="Arial" w:hAnsi="Arial" w:cs="Arial"/>
@@ -495,6 +498,18 @@
           <w:sz w:val="22"/>
           <w:szCs w:val="22"/>
         </w:rPr>
+        <w:t>}</w:t>
+      </w:r>
+      <w:r>
+        <w:rPr>
+          <w:rFonts w:ascii="Arial" w:eastAsia="Arial" w:hAnsi="Arial" w:cs="Arial"/>
+          <w:b/>
+          <w:bCs/>
+          <w:color w:val="000000" w:themeColor="text1"/>
+          <w:spacing w:val="7"/>
+          <w:sz w:val="22"/>
+          <w:szCs w:val="22"/>
+        </w:rPr>
         <w:t xml:space="preserve"> </w:t>
       </w:r>
       <w:r>
@@ -572,6 +587,7 @@
         </w:rPr>
         <w:t>{tanggal_</w:t>
       </w:r>
+      <w:proofErr w:type="spellStart"/>
       <w:r>
         <w:rPr>
           <w:rFonts w:ascii="Arial" w:eastAsia="Arial" w:hAnsi="Arial" w:cs="Arial"/>
@@ -582,8 +598,9 @@
           <w:szCs w:val="22"/>
           <w:lang w:val="en-US"/>
         </w:rPr>
-        <w:t>sebut_</w:t>
-      </w:r>
+        <w:t>sebut</w:t>
+      </w:r>
+      <w:proofErr w:type="spellEnd"/>
       <w:r>
         <w:rPr>
           <w:rFonts w:ascii="Arial" w:eastAsia="Arial" w:hAnsi="Arial" w:cs="Arial"/>
@@ -592,8 +609,9 @@
           <w:spacing w:val="5"/>
           <w:sz w:val="22"/>
           <w:szCs w:val="22"/>
-        </w:rPr>
-        <w:t>reviu</w:t>
+          <w:lang w:val="en-US"/>
+        </w:rPr>
+        <w:t>_</w:t>
       </w:r>
       <w:r>
         <w:rPr>
@@ -604,7 +622,7 @@
           <w:sz w:val="22"/>
           <w:szCs w:val="22"/>
         </w:rPr>
-        <w:t>}</w:t>
+        <w:t>reviu</w:t>
       </w:r>
       <w:r>
         <w:rPr>
@@ -615,6 +633,17 @@
           <w:sz w:val="22"/>
           <w:szCs w:val="22"/>
         </w:rPr>
+        <w:t>}</w:t>
+      </w:r>
+      <w:r>
+        <w:rPr>
+          <w:rFonts w:ascii="Arial" w:eastAsia="Arial" w:hAnsi="Arial" w:cs="Arial"/>
+          <w:b/>
+          <w:bCs/>
+          <w:spacing w:val="5"/>
+          <w:sz w:val="22"/>
+          <w:szCs w:val="22"/>
+        </w:rPr>
         <w:t xml:space="preserve"> </w:t>
       </w:r>
       <w:r>
@@ -681,6 +710,7 @@
         </w:rPr>
         <w:t>{bulan_</w:t>
       </w:r>
+      <w:proofErr w:type="spellStart"/>
       <w:r>
         <w:rPr>
           <w:rFonts w:ascii="Arial" w:eastAsia="Arial" w:hAnsi="Arial" w:cs="Arial"/>
@@ -691,8 +721,9 @@
           <w:szCs w:val="22"/>
           <w:lang w:val="en-US"/>
         </w:rPr>
-        <w:t>sebut_</w:t>
-      </w:r>
+        <w:t>sebut</w:t>
+      </w:r>
+      <w:proofErr w:type="spellEnd"/>
       <w:r>
         <w:rPr>
           <w:rFonts w:ascii="Arial" w:eastAsia="Arial" w:hAnsi="Arial" w:cs="Arial"/>
@@ -701,8 +732,9 @@
           <w:spacing w:val="6"/>
           <w:sz w:val="22"/>
           <w:szCs w:val="22"/>
-        </w:rPr>
-        <w:t>reviu</w:t>
+          <w:lang w:val="en-US"/>
+        </w:rPr>
+        <w:t>_</w:t>
       </w:r>
       <w:r>
         <w:rPr>
@@ -713,7 +745,7 @@
           <w:sz w:val="22"/>
           <w:szCs w:val="22"/>
         </w:rPr>
-        <w:t>}</w:t>
+        <w:t>reviu</w:t>
       </w:r>
       <w:r>
         <w:rPr>
@@ -724,6 +756,17 @@
           <w:sz w:val="22"/>
           <w:szCs w:val="22"/>
         </w:rPr>
+        <w:t>}</w:t>
+      </w:r>
+      <w:r>
+        <w:rPr>
+          <w:rFonts w:ascii="Arial" w:eastAsia="Arial" w:hAnsi="Arial" w:cs="Arial"/>
+          <w:b/>
+          <w:bCs/>
+          <w:spacing w:val="6"/>
+          <w:sz w:val="22"/>
+          <w:szCs w:val="22"/>
+        </w:rPr>
         <w:t xml:space="preserve"> </w:t>
       </w:r>
       <w:r>
@@ -781,6 +824,7 @@
         </w:rPr>
         <w:t>{tahun_</w:t>
       </w:r>
+      <w:proofErr w:type="spellStart"/>
       <w:r>
         <w:rPr>
           <w:rFonts w:ascii="Arial" w:eastAsia="Arial" w:hAnsi="Arial" w:cs="Arial"/>
@@ -791,7 +835,20 @@
           <w:szCs w:val="22"/>
           <w:lang w:val="en-US"/>
         </w:rPr>
-        <w:t>sebut_</w:t>
+        <w:t>sebut</w:t>
+      </w:r>
+      <w:proofErr w:type="spellEnd"/>
+      <w:r>
+        <w:rPr>
+          <w:rFonts w:ascii="Arial" w:eastAsia="Arial" w:hAnsi="Arial" w:cs="Arial"/>
+          <w:b/>
+          <w:bCs/>
+          <w:spacing w:val="1"/>
+          <w:sz w:val="22"/>
+          <w:szCs w:val="22"/>
+          <w:lang w:val="en-US"/>
+        </w:rPr>
+        <w:t>_</w:t>
       </w:r>
       <w:r>
         <w:rPr>
@@ -1620,6 +1677,7 @@
               </w:rPr>
               <w:t>P</w:t>
             </w:r>
+            <w:proofErr w:type="spellStart"/>
             <w:r>
               <w:rPr>
                 <w:rFonts w:ascii="Arial" w:eastAsia="Arial" w:hAnsi="Arial" w:cs="Arial"/>
@@ -1628,7 +1686,40 @@
                 <w:szCs w:val="22"/>
                 <w:lang w:val="en-US"/>
               </w:rPr>
-              <w:t>ejabat Pembuat Komitmen</w:t>
+              <w:t>ejabat</w:t>
+            </w:r>
+            <w:proofErr w:type="spellEnd"/>
+            <w:r>
+              <w:rPr>
+                <w:rFonts w:ascii="Arial" w:eastAsia="Arial" w:hAnsi="Arial" w:cs="Arial"/>
+                <w:spacing w:val="-2"/>
+                <w:sz w:val="22"/>
+                <w:szCs w:val="22"/>
+                <w:lang w:val="en-US"/>
+              </w:rPr>
+              <w:t xml:space="preserve"> </w:t>
+            </w:r>
+            <w:proofErr w:type="spellStart"/>
+            <w:r>
+              <w:rPr>
+                <w:rFonts w:ascii="Arial" w:eastAsia="Arial" w:hAnsi="Arial" w:cs="Arial"/>
+                <w:spacing w:val="-2"/>
+                <w:sz w:val="22"/>
+                <w:szCs w:val="22"/>
+                <w:lang w:val="en-US"/>
+              </w:rPr>
+              <w:t>Pembuat</w:t>
+            </w:r>
+            <w:proofErr w:type="spellEnd"/>
+            <w:r>
+              <w:rPr>
+                <w:rFonts w:ascii="Arial" w:eastAsia="Arial" w:hAnsi="Arial" w:cs="Arial"/>
+                <w:spacing w:val="-2"/>
+                <w:sz w:val="22"/>
+                <w:szCs w:val="22"/>
+                <w:lang w:val="en-US"/>
+              </w:rPr>
+              <w:t xml:space="preserve"> Komitmen</w:t>
             </w:r>
           </w:p>
         </w:tc>
@@ -1877,6 +1968,7 @@
               </w:rPr>
               <w:t>{metode_</w:t>
             </w:r>
+            <w:proofErr w:type="spellStart"/>
             <w:r>
               <w:rPr>
                 <w:rFonts w:ascii="Arial" w:hAnsi="Arial" w:cs="Arial"/>
@@ -1886,6 +1978,7 @@
               </w:rPr>
               <w:t>pemilihan</w:t>
             </w:r>
+            <w:proofErr w:type="spellEnd"/>
             <w:r>
               <w:rPr>
                 <w:rFonts w:ascii="Arial" w:hAnsi="Arial" w:cs="Arial"/>
@@ -4225,6 +4318,45 @@
       <w:pPr>
         <w:pStyle w:val="ListParagraph"/>
         <w:spacing w:line="276" w:lineRule="auto"/>
+        <w:ind w:left="709" w:right="93"/>
+        <w:jc w:val="both"/>
+        <w:rPr>
+          <w:rFonts w:ascii="Arial" w:eastAsia="Arial" w:hAnsi="Arial" w:cs="Arial"/>
+          <w:sz w:val="22"/>
+          <w:szCs w:val="22"/>
+        </w:rPr>
+      </w:pPr>
+    </w:p>
+    <w:p>
+      <w:pPr>
+        <w:pStyle w:val="ListParagraph"/>
+        <w:spacing w:line="276" w:lineRule="auto"/>
+        <w:ind w:left="709" w:right="93"/>
+        <w:jc w:val="both"/>
+        <w:rPr>
+          <w:rFonts w:ascii="Arial" w:eastAsia="Arial" w:hAnsi="Arial" w:cs="Arial"/>
+          <w:sz w:val="22"/>
+          <w:szCs w:val="22"/>
+        </w:rPr>
+      </w:pPr>
+    </w:p>
+    <w:p>
+      <w:pPr>
+        <w:pStyle w:val="ListParagraph"/>
+        <w:spacing w:line="276" w:lineRule="auto"/>
+        <w:ind w:left="709" w:right="93"/>
+        <w:jc w:val="both"/>
+        <w:rPr>
+          <w:rFonts w:ascii="Arial" w:eastAsia="Arial" w:hAnsi="Arial" w:cs="Arial"/>
+          <w:sz w:val="22"/>
+          <w:szCs w:val="22"/>
+        </w:rPr>
+      </w:pPr>
+    </w:p>
+    <w:p>
+      <w:pPr>
+        <w:pStyle w:val="ListParagraph"/>
+        <w:spacing w:line="276" w:lineRule="auto"/>
         <w:ind w:left="927" w:right="93"/>
         <w:jc w:val="right"/>
         <w:rPr>
@@ -4311,7 +4443,6 @@
           <w:sz w:val="22"/>
           <w:szCs w:val="22"/>
         </w:rPr>
-        <w:lastRenderedPageBreak/>
         <w:t>Standar Operasional Prosedur Nomor 13/SOP.04/</w:t>
       </w:r>
       <w:r>
@@ -4927,6 +5058,32 @@
     </w:p>
     <w:p>
       <w:pPr>
+        <w:spacing w:line="276" w:lineRule="auto"/>
+        <w:ind w:right="28"/>
+        <w:jc w:val="both"/>
+        <w:rPr>
+          <w:rFonts w:ascii="Arial" w:eastAsia="Arial" w:hAnsi="Arial" w:cs="Arial"/>
+          <w:spacing w:val="-2"/>
+          <w:sz w:val="22"/>
+          <w:szCs w:val="22"/>
+        </w:rPr>
+      </w:pPr>
+    </w:p>
+    <w:p>
+      <w:pPr>
+        <w:spacing w:line="276" w:lineRule="auto"/>
+        <w:ind w:right="28"/>
+        <w:jc w:val="both"/>
+        <w:rPr>
+          <w:rFonts w:ascii="Arial" w:eastAsia="Arial" w:hAnsi="Arial" w:cs="Arial"/>
+          <w:spacing w:val="-2"/>
+          <w:sz w:val="22"/>
+          <w:szCs w:val="22"/>
+        </w:rPr>
+      </w:pPr>
+    </w:p>
+    <w:p>
+      <w:pPr>
         <w:pStyle w:val="ListParagraph"/>
         <w:spacing w:line="276" w:lineRule="auto"/>
         <w:ind w:left="284" w:right="28"/>
@@ -4988,7 +5145,13 @@
           <w:szCs w:val="22"/>
         </w:rPr>
       </w:pPr>
-      <w:r>
+    </w:p>
+    <w:p>
+      <w:pPr>
+        <w:pStyle w:val="ListParagraph"/>
+        <w:spacing w:line="276" w:lineRule="auto"/>
+        <w:ind w:left="284" w:right="28"/>
+        <w:jc w:val="right"/>
         <w:rPr>
           <w:rFonts w:ascii="Arial" w:eastAsia="Arial" w:hAnsi="Arial" w:cs="Arial"/>
           <w:i/>
@@ -4997,24 +5160,47 @@
           <w:sz w:val="22"/>
           <w:szCs w:val="22"/>
         </w:rPr>
-        <w:t>3. Hasil...</w:t>
-      </w:r>
+      </w:pPr>
     </w:p>
     <w:p>
       <w:pPr>
-        <w:rPr>
-          <w:rFonts w:ascii="Arial" w:eastAsia="Arial" w:hAnsi="Arial" w:cs="Arial"/>
+        <w:pStyle w:val="ListParagraph"/>
+        <w:spacing w:line="276" w:lineRule="auto"/>
+        <w:ind w:left="284" w:right="28"/>
+        <w:jc w:val="right"/>
+        <w:rPr>
+          <w:rFonts w:ascii="Arial" w:eastAsia="Arial" w:hAnsi="Arial" w:cs="Arial"/>
+          <w:i/>
+          <w:iCs/>
           <w:spacing w:val="-2"/>
           <w:sz w:val="22"/>
           <w:szCs w:val="22"/>
         </w:rPr>
+      </w:pPr>
+      <w:r>
+        <w:rPr>
+          <w:rFonts w:ascii="Arial" w:eastAsia="Arial" w:hAnsi="Arial" w:cs="Arial"/>
+          <w:i/>
+          <w:iCs/>
+          <w:spacing w:val="-2"/>
+          <w:sz w:val="22"/>
+          <w:szCs w:val="22"/>
+        </w:rPr>
+        <w:t>3. Hasil...</w:t>
+      </w:r>
+    </w:p>
+    <w:p>
+      <w:pPr>
+        <w:rPr>
+          <w:rFonts w:ascii="Arial" w:eastAsia="Arial" w:hAnsi="Arial" w:cs="Arial"/>
+          <w:spacing w:val="-2"/>
+          <w:sz w:val="22"/>
+          <w:szCs w:val="22"/>
+        </w:rPr>
         <w:sectPr>
-          <w:headerReference w:type="even" r:id="rId11"/>
-          <w:headerReference w:type="default" r:id="rId12"/>
-          <w:footerReference w:type="even" r:id="rId13"/>
-          <w:footerReference w:type="default" r:id="rId14"/>
-          <w:headerReference w:type="first" r:id="rId15"/>
-          <w:footerReference w:type="first" r:id="rId16"/>
+          <w:footerReference w:type="default" r:id="rId11"/>
+          <w:headerReference w:type="first" r:id="rId12"/>
+          <w:footerReference w:type="first" r:id="rId13"/>
           <w:pgSz w:w="11920" w:h="16840"/>
           <w:pgMar w:top="1134" w:right="1134" w:bottom="1134" w:left="1418" w:header="720" w:footer="369" w:gutter="0"/>
           <w:pgNumType w:fmt="numberInDash" w:start="1"/>
@@ -5256,6 +5442,7 @@
                 <w:lang w:val="en-US"/>
               </w:rPr>
             </w:pPr>
+            <w:proofErr w:type="spellStart"/>
             <w:r>
               <w:rPr>
                 <w:rFonts w:ascii="Arial" w:hAnsi="Arial" w:cs="Arial"/>
@@ -5265,21 +5452,10 @@
                 <w:szCs w:val="18"/>
                 <w:lang w:val="en-US"/>
               </w:rPr>
-              <w:t>Pokja Pemilihan</w:t>
-            </w:r>
-          </w:p>
-        </w:tc>
-        <w:tc>
-          <w:tcPr>
-            <w:tcW w:w="2268" w:type="dxa"/>
-            <w:vAlign w:val="center"/>
-          </w:tcPr>
-          <w:p>
-            <w:pPr>
-              <w:pStyle w:val="ListParagraph"/>
-              <w:spacing w:line="276" w:lineRule="auto"/>
-              <w:ind w:left="0"/>
-              <w:jc w:val="center"/>
+              <w:t>Pokja</w:t>
+            </w:r>
+            <w:proofErr w:type="spellEnd"/>
+            <w:r>
               <w:rPr>
                 <w:rFonts w:ascii="Arial" w:hAnsi="Arial" w:cs="Arial"/>
                 <w:b/>
@@ -5288,7 +5464,9 @@
                 <w:szCs w:val="18"/>
                 <w:lang w:val="en-US"/>
               </w:rPr>
-            </w:pPr>
+              <w:t xml:space="preserve"> </w:t>
+            </w:r>
+            <w:proofErr w:type="spellStart"/>
             <w:r>
               <w:rPr>
                 <w:rFonts w:ascii="Arial" w:hAnsi="Arial" w:cs="Arial"/>
@@ -5298,8 +5476,55 @@
                 <w:szCs w:val="18"/>
                 <w:lang w:val="en-US"/>
               </w:rPr>
-              <w:t>Tim Pelaksana</w:t>
-            </w:r>
+              <w:t>Pemilihan</w:t>
+            </w:r>
+            <w:proofErr w:type="spellEnd"/>
+          </w:p>
+        </w:tc>
+        <w:tc>
+          <w:tcPr>
+            <w:tcW w:w="2268" w:type="dxa"/>
+            <w:vAlign w:val="center"/>
+          </w:tcPr>
+          <w:p>
+            <w:pPr>
+              <w:pStyle w:val="ListParagraph"/>
+              <w:spacing w:line="276" w:lineRule="auto"/>
+              <w:ind w:left="0"/>
+              <w:jc w:val="center"/>
+              <w:rPr>
+                <w:rFonts w:ascii="Arial" w:hAnsi="Arial" w:cs="Arial"/>
+                <w:b/>
+                <w:bCs/>
+                <w:sz w:val="18"/>
+                <w:szCs w:val="18"/>
+                <w:lang w:val="en-US"/>
+              </w:rPr>
+            </w:pPr>
+            <w:r>
+              <w:rPr>
+                <w:rFonts w:ascii="Arial" w:hAnsi="Arial" w:cs="Arial"/>
+                <w:b/>
+                <w:bCs/>
+                <w:sz w:val="18"/>
+                <w:szCs w:val="18"/>
+                <w:lang w:val="en-US"/>
+              </w:rPr>
+              <w:t xml:space="preserve">Tim </w:t>
+            </w:r>
+            <w:proofErr w:type="spellStart"/>
+            <w:r>
+              <w:rPr>
+                <w:rFonts w:ascii="Arial" w:hAnsi="Arial" w:cs="Arial"/>
+                <w:b/>
+                <w:bCs/>
+                <w:sz w:val="18"/>
+                <w:szCs w:val="18"/>
+                <w:lang w:val="en-US"/>
+              </w:rPr>
+              <w:t>Pelaksana</w:t>
+            </w:r>
+            <w:proofErr w:type="spellEnd"/>
           </w:p>
         </w:tc>
         <w:tc>
@@ -5460,7 +5685,27 @@
                 <w:szCs w:val="18"/>
                 <w:lang w:val="en-US"/>
               </w:rPr>
-              <w:t>{kode_rup}</w:t>
+              <w:t>{</w:t>
+            </w:r>
+            <w:proofErr w:type="spellStart"/>
+            <w:r>
+              <w:rPr>
+                <w:rFonts w:ascii="Arial" w:hAnsi="Arial" w:cs="Arial"/>
+                <w:sz w:val="18"/>
+                <w:szCs w:val="18"/>
+                <w:lang w:val="en-US"/>
+              </w:rPr>
+              <w:t>kode_rup</w:t>
+            </w:r>
+            <w:proofErr w:type="spellEnd"/>
+            <w:r>
+              <w:rPr>
+                <w:rFonts w:ascii="Arial" w:hAnsi="Arial" w:cs="Arial"/>
+                <w:sz w:val="18"/>
+                <w:szCs w:val="18"/>
+                <w:lang w:val="en-US"/>
+              </w:rPr>
+              <w:t>}</w:t>
             </w:r>
           </w:p>
         </w:tc>
@@ -5623,7 +5868,27 @@
                 <w:szCs w:val="18"/>
                 <w:lang w:val="en-US"/>
               </w:rPr>
-              <w:t>{metode_pemilihan_front}</w:t>
+              <w:t>{</w:t>
+            </w:r>
+            <w:proofErr w:type="spellStart"/>
+            <w:r>
+              <w:rPr>
+                <w:rFonts w:ascii="Arial" w:hAnsi="Arial" w:cs="Arial"/>
+                <w:sz w:val="18"/>
+                <w:szCs w:val="18"/>
+                <w:lang w:val="en-US"/>
+              </w:rPr>
+              <w:t>metode_pemilihan_front</w:t>
+            </w:r>
+            <w:proofErr w:type="spellEnd"/>
+            <w:r>
+              <w:rPr>
+                <w:rFonts w:ascii="Arial" w:hAnsi="Arial" w:cs="Arial"/>
+                <w:sz w:val="18"/>
+                <w:szCs w:val="18"/>
+                <w:lang w:val="en-US"/>
+              </w:rPr>
+              <w:t>}</w:t>
             </w:r>
           </w:p>
         </w:tc>
@@ -5775,7 +6040,27 @@
                 <w:szCs w:val="18"/>
                 <w:lang w:val="en-US"/>
               </w:rPr>
-              <w:t>{nama_paket}</w:t>
+              <w:t>{</w:t>
+            </w:r>
+            <w:proofErr w:type="spellStart"/>
+            <w:r>
+              <w:rPr>
+                <w:rFonts w:ascii="Arial" w:hAnsi="Arial" w:cs="Arial"/>
+                <w:sz w:val="18"/>
+                <w:szCs w:val="18"/>
+                <w:lang w:val="en-US"/>
+              </w:rPr>
+              <w:t>nama_paket</w:t>
+            </w:r>
+            <w:proofErr w:type="spellEnd"/>
+            <w:r>
+              <w:rPr>
+                <w:rFonts w:ascii="Arial" w:hAnsi="Arial" w:cs="Arial"/>
+                <w:sz w:val="18"/>
+                <w:szCs w:val="18"/>
+                <w:lang w:val="en-US"/>
+              </w:rPr>
+              <w:t>}</w:t>
             </w:r>
           </w:p>
         </w:tc>
@@ -5927,7 +6212,27 @@
                 <w:szCs w:val="18"/>
                 <w:lang w:val="en-US"/>
               </w:rPr>
-              <w:t>{nama_ppk}</w:t>
+              <w:t>{</w:t>
+            </w:r>
+            <w:proofErr w:type="spellStart"/>
+            <w:r>
+              <w:rPr>
+                <w:rFonts w:ascii="Arial" w:hAnsi="Arial" w:cs="Arial"/>
+                <w:sz w:val="18"/>
+                <w:szCs w:val="18"/>
+                <w:lang w:val="en-US"/>
+              </w:rPr>
+              <w:t>nama_ppk</w:t>
+            </w:r>
+            <w:proofErr w:type="spellEnd"/>
+            <w:r>
+              <w:rPr>
+                <w:rFonts w:ascii="Arial" w:hAnsi="Arial" w:cs="Arial"/>
+                <w:sz w:val="18"/>
+                <w:szCs w:val="18"/>
+                <w:lang w:val="en-US"/>
+              </w:rPr>
+              <w:t>}</w:t>
             </w:r>
           </w:p>
         </w:tc>
@@ -6055,8 +6360,9 @@
                 <w:szCs w:val="18"/>
                 <w:lang w:val="en-US"/>
               </w:rPr>
-              <w:t>{ppk}</w:t>
-            </w:r>
+              <w:t>{</w:t>
+            </w:r>
+            <w:proofErr w:type="spellStart"/>
             <w:r>
               <w:rPr>
                 <w:rFonts w:ascii="Arial" w:hAnsi="Arial" w:cs="Arial"/>
@@ -6064,7 +6370,46 @@
                 <w:szCs w:val="18"/>
                 <w:lang w:val="en-US"/>
               </w:rPr>
-              <w:t>,{gelar_ppk}</w:t>
+              <w:t>ppk</w:t>
+            </w:r>
+            <w:proofErr w:type="spellEnd"/>
+            <w:r>
+              <w:rPr>
+                <w:rFonts w:ascii="Arial" w:hAnsi="Arial" w:cs="Arial"/>
+                <w:sz w:val="18"/>
+                <w:szCs w:val="18"/>
+                <w:lang w:val="en-US"/>
+              </w:rPr>
+              <w:t>}</w:t>
+            </w:r>
+            <w:r>
+              <w:rPr>
+                <w:rFonts w:ascii="Arial" w:hAnsi="Arial" w:cs="Arial"/>
+                <w:sz w:val="18"/>
+                <w:szCs w:val="18"/>
+                <w:lang w:val="en-US"/>
+              </w:rPr>
+              <w:t>,{</w:t>
+            </w:r>
+            <w:proofErr w:type="spellStart"/>
+            <w:r>
+              <w:rPr>
+                <w:rFonts w:ascii="Arial" w:hAnsi="Arial" w:cs="Arial"/>
+                <w:sz w:val="18"/>
+                <w:szCs w:val="18"/>
+                <w:lang w:val="en-US"/>
+              </w:rPr>
+              <w:t>gelar_ppk</w:t>
+            </w:r>
+            <w:proofErr w:type="spellEnd"/>
+            <w:r>
+              <w:rPr>
+                <w:rFonts w:ascii="Arial" w:hAnsi="Arial" w:cs="Arial"/>
+                <w:sz w:val="18"/>
+                <w:szCs w:val="18"/>
+                <w:lang w:val="en-US"/>
+              </w:rPr>
+              <w:t>}</w:t>
             </w:r>
           </w:p>
         </w:tc>
@@ -6216,7 +6561,27 @@
                 <w:szCs w:val="18"/>
                 <w:lang w:val="en-US"/>
               </w:rPr>
-              <w:t>{nilai_pagu}</w:t>
+              <w:t>{</w:t>
+            </w:r>
+            <w:proofErr w:type="spellStart"/>
+            <w:r>
+              <w:rPr>
+                <w:rFonts w:ascii="Arial" w:hAnsi="Arial" w:cs="Arial"/>
+                <w:sz w:val="18"/>
+                <w:szCs w:val="18"/>
+                <w:lang w:val="en-US"/>
+              </w:rPr>
+              <w:t>nilai_pagu</w:t>
+            </w:r>
+            <w:proofErr w:type="spellEnd"/>
+            <w:r>
+              <w:rPr>
+                <w:rFonts w:ascii="Arial" w:hAnsi="Arial" w:cs="Arial"/>
+                <w:sz w:val="18"/>
+                <w:szCs w:val="18"/>
+                <w:lang w:val="en-US"/>
+              </w:rPr>
+              <w:t>}</w:t>
             </w:r>
           </w:p>
         </w:tc>
@@ -6368,7 +6733,27 @@
                 <w:szCs w:val="18"/>
                 <w:lang w:val="en-US"/>
               </w:rPr>
-              <w:t>{sumber_dana}</w:t>
+              <w:t>{</w:t>
+            </w:r>
+            <w:proofErr w:type="spellStart"/>
+            <w:r>
+              <w:rPr>
+                <w:rFonts w:ascii="Arial" w:hAnsi="Arial" w:cs="Arial"/>
+                <w:sz w:val="18"/>
+                <w:szCs w:val="18"/>
+                <w:lang w:val="en-US"/>
+              </w:rPr>
+              <w:t>sumber_dana</w:t>
+            </w:r>
+            <w:proofErr w:type="spellEnd"/>
+            <w:r>
+              <w:rPr>
+                <w:rFonts w:ascii="Arial" w:hAnsi="Arial" w:cs="Arial"/>
+                <w:sz w:val="18"/>
+                <w:szCs w:val="18"/>
+                <w:lang w:val="en-US"/>
+              </w:rPr>
+              <w:t>}</w:t>
             </w:r>
           </w:p>
         </w:tc>
@@ -6520,7 +6905,27 @@
                 <w:szCs w:val="18"/>
                 <w:lang w:val="en-US"/>
               </w:rPr>
-              <w:t>{persentase_ppn}</w:t>
+              <w:t>{</w:t>
+            </w:r>
+            <w:proofErr w:type="spellStart"/>
+            <w:r>
+              <w:rPr>
+                <w:rFonts w:ascii="Arial" w:hAnsi="Arial" w:cs="Arial"/>
+                <w:sz w:val="18"/>
+                <w:szCs w:val="18"/>
+                <w:lang w:val="en-US"/>
+              </w:rPr>
+              <w:t>persentase_ppn</w:t>
+            </w:r>
+            <w:proofErr w:type="spellEnd"/>
+            <w:r>
+              <w:rPr>
+                <w:rFonts w:ascii="Arial" w:hAnsi="Arial" w:cs="Arial"/>
+                <w:sz w:val="18"/>
+                <w:szCs w:val="18"/>
+                <w:lang w:val="en-US"/>
+              </w:rPr>
+              <w:t>}</w:t>
             </w:r>
           </w:p>
         </w:tc>
@@ -6672,7 +7077,27 @@
                 <w:szCs w:val="18"/>
                 <w:lang w:val="en-US"/>
               </w:rPr>
-              <w:t>{unit_organisasi}</w:t>
+              <w:t>{</w:t>
+            </w:r>
+            <w:proofErr w:type="spellStart"/>
+            <w:r>
+              <w:rPr>
+                <w:rFonts w:ascii="Arial" w:hAnsi="Arial" w:cs="Arial"/>
+                <w:sz w:val="18"/>
+                <w:szCs w:val="18"/>
+                <w:lang w:val="en-US"/>
+              </w:rPr>
+              <w:t>unit_organisasi</w:t>
+            </w:r>
+            <w:proofErr w:type="spellEnd"/>
+            <w:r>
+              <w:rPr>
+                <w:rFonts w:ascii="Arial" w:hAnsi="Arial" w:cs="Arial"/>
+                <w:sz w:val="18"/>
+                <w:szCs w:val="18"/>
+                <w:lang w:val="en-US"/>
+              </w:rPr>
+              <w:t>}</w:t>
             </w:r>
           </w:p>
         </w:tc>
@@ -6826,6 +7251,7 @@
               </w:rPr>
               <w:t>{</w:t>
             </w:r>
+            <w:proofErr w:type="spellStart"/>
             <w:r>
               <w:rPr>
                 <w:rFonts w:ascii="Arial" w:hAnsi="Arial" w:cs="Arial"/>
@@ -6833,7 +7259,17 @@
                 <w:szCs w:val="18"/>
                 <w:lang w:val="en-US"/>
               </w:rPr>
-              <w:t>direktorat_teknis}</w:t>
+              <w:t>direktorat_teknis</w:t>
+            </w:r>
+            <w:proofErr w:type="spellEnd"/>
+            <w:r>
+              <w:rPr>
+                <w:rFonts w:ascii="Arial" w:hAnsi="Arial" w:cs="Arial"/>
+                <w:sz w:val="18"/>
+                <w:szCs w:val="18"/>
+                <w:lang w:val="en-US"/>
+              </w:rPr>
+              <w:t>}</w:t>
             </w:r>
           </w:p>
         </w:tc>
@@ -6985,7 +7421,27 @@
                 <w:szCs w:val="18"/>
                 <w:lang w:val="en-US"/>
               </w:rPr>
-              <w:t>{balai}</w:t>
+              <w:t>{</w:t>
+            </w:r>
+            <w:proofErr w:type="spellStart"/>
+            <w:r>
+              <w:rPr>
+                <w:rFonts w:ascii="Arial" w:hAnsi="Arial" w:cs="Arial"/>
+                <w:sz w:val="18"/>
+                <w:szCs w:val="18"/>
+                <w:lang w:val="en-US"/>
+              </w:rPr>
+              <w:t>balai</w:t>
+            </w:r>
+            <w:proofErr w:type="spellEnd"/>
+            <w:r>
+              <w:rPr>
+                <w:rFonts w:ascii="Arial" w:hAnsi="Arial" w:cs="Arial"/>
+                <w:sz w:val="18"/>
+                <w:szCs w:val="18"/>
+                <w:lang w:val="en-US"/>
+              </w:rPr>
+              <w:t>}</w:t>
             </w:r>
           </w:p>
         </w:tc>
@@ -7137,7 +7593,27 @@
                 <w:szCs w:val="18"/>
                 <w:lang w:val="en-US"/>
               </w:rPr>
-              <w:t>{satuan_kerja}</w:t>
+              <w:t>{</w:t>
+            </w:r>
+            <w:proofErr w:type="spellStart"/>
+            <w:r>
+              <w:rPr>
+                <w:rFonts w:ascii="Arial" w:hAnsi="Arial" w:cs="Arial"/>
+                <w:sz w:val="18"/>
+                <w:szCs w:val="18"/>
+                <w:lang w:val="en-US"/>
+              </w:rPr>
+              <w:t>satuan_kerja</w:t>
+            </w:r>
+            <w:proofErr w:type="spellEnd"/>
+            <w:r>
+              <w:rPr>
+                <w:rFonts w:ascii="Arial" w:hAnsi="Arial" w:cs="Arial"/>
+                <w:sz w:val="18"/>
+                <w:szCs w:val="18"/>
+                <w:lang w:val="en-US"/>
+              </w:rPr>
+              <w:t>}</w:t>
             </w:r>
           </w:p>
         </w:tc>
@@ -7439,8 +7915,9 @@
                 <w:szCs w:val="18"/>
                 <w:lang w:val="en-US"/>
               </w:rPr>
-              <w:t>{jangka_waktu}</w:t>
-            </w:r>
+              <w:t>{</w:t>
+            </w:r>
+            <w:proofErr w:type="spellStart"/>
             <w:r>
               <w:rPr>
                 <w:rFonts w:ascii="Arial" w:hAnsi="Arial" w:cs="Arial"/>
@@ -7448,8 +7925,38 @@
                 <w:szCs w:val="18"/>
                 <w:lang w:val="en-US"/>
               </w:rPr>
-              <w:t xml:space="preserve"> hari</w:t>
-            </w:r>
+              <w:t>jangka_waktu</w:t>
+            </w:r>
+            <w:proofErr w:type="spellEnd"/>
+            <w:r>
+              <w:rPr>
+                <w:rFonts w:ascii="Arial" w:hAnsi="Arial" w:cs="Arial"/>
+                <w:sz w:val="18"/>
+                <w:szCs w:val="18"/>
+                <w:lang w:val="en-US"/>
+              </w:rPr>
+              <w:t>}</w:t>
+            </w:r>
+            <w:r>
+              <w:rPr>
+                <w:rFonts w:ascii="Arial" w:hAnsi="Arial" w:cs="Arial"/>
+                <w:sz w:val="18"/>
+                <w:szCs w:val="18"/>
+                <w:lang w:val="en-US"/>
+              </w:rPr>
+              <w:t xml:space="preserve"> </w:t>
+            </w:r>
+            <w:proofErr w:type="spellStart"/>
+            <w:r>
+              <w:rPr>
+                <w:rFonts w:ascii="Arial" w:hAnsi="Arial" w:cs="Arial"/>
+                <w:sz w:val="18"/>
+                <w:szCs w:val="18"/>
+                <w:lang w:val="en-US"/>
+              </w:rPr>
+              <w:t>hari</w:t>
+            </w:r>
+            <w:proofErr w:type="spellEnd"/>
           </w:p>
         </w:tc>
         <w:tc>
@@ -7600,7 +8107,27 @@
                 <w:szCs w:val="18"/>
                 <w:lang w:val="en-US"/>
               </w:rPr>
-              <w:t>{tahun_anggaran}</w:t>
+              <w:t>{</w:t>
+            </w:r>
+            <w:proofErr w:type="spellStart"/>
+            <w:r>
+              <w:rPr>
+                <w:rFonts w:ascii="Arial" w:hAnsi="Arial" w:cs="Arial"/>
+                <w:sz w:val="18"/>
+                <w:szCs w:val="18"/>
+                <w:lang w:val="en-US"/>
+              </w:rPr>
+              <w:t>tahun_anggaran</w:t>
+            </w:r>
+            <w:proofErr w:type="spellEnd"/>
+            <w:r>
+              <w:rPr>
+                <w:rFonts w:ascii="Arial" w:hAnsi="Arial" w:cs="Arial"/>
+                <w:sz w:val="18"/>
+                <w:szCs w:val="18"/>
+                <w:lang w:val="en-US"/>
+              </w:rPr>
+              <w:t>}</w:t>
             </w:r>
           </w:p>
         </w:tc>
@@ -7871,7 +8398,27 @@
                 <w:szCs w:val="18"/>
                 <w:lang w:val="en-US"/>
               </w:rPr>
-              <w:t>{lokasi_pekerjaan}</w:t>
+              <w:t>{</w:t>
+            </w:r>
+            <w:proofErr w:type="spellStart"/>
+            <w:r>
+              <w:rPr>
+                <w:rFonts w:ascii="Arial" w:hAnsi="Arial" w:cs="Arial"/>
+                <w:sz w:val="18"/>
+                <w:szCs w:val="18"/>
+                <w:lang w:val="en-US"/>
+              </w:rPr>
+              <w:t>lokasi_pekerjaan</w:t>
+            </w:r>
+            <w:proofErr w:type="spellEnd"/>
+            <w:r>
+              <w:rPr>
+                <w:rFonts w:ascii="Arial" w:hAnsi="Arial" w:cs="Arial"/>
+                <w:sz w:val="18"/>
+                <w:szCs w:val="18"/>
+                <w:lang w:val="en-US"/>
+              </w:rPr>
+              <w:t>}</w:t>
             </w:r>
           </w:p>
         </w:tc>
@@ -8169,7 +8716,27 @@
                 <w:szCs w:val="18"/>
                 <w:lang w:val="en-US"/>
               </w:rPr>
-              <w:t>{lingkup_pekerjaan}</w:t>
+              <w:t>{</w:t>
+            </w:r>
+            <w:proofErr w:type="spellStart"/>
+            <w:r>
+              <w:rPr>
+                <w:rFonts w:ascii="Arial" w:hAnsi="Arial" w:cs="Arial"/>
+                <w:sz w:val="18"/>
+                <w:szCs w:val="18"/>
+                <w:lang w:val="en-US"/>
+              </w:rPr>
+              <w:t>lingkup_pekerjaan</w:t>
+            </w:r>
+            <w:proofErr w:type="spellEnd"/>
+            <w:r>
+              <w:rPr>
+                <w:rFonts w:ascii="Arial" w:hAnsi="Arial" w:cs="Arial"/>
+                <w:sz w:val="18"/>
+                <w:szCs w:val="18"/>
+                <w:lang w:val="en-US"/>
+              </w:rPr>
+              <w:t>}</w:t>
             </w:r>
           </w:p>
         </w:tc>
@@ -9404,8 +9971,20 @@
                 <w:highlight w:val="yellow"/>
                 <w:lang w:val="en-US"/>
               </w:rPr>
-              <w:t>Metode Kerja</w:t>
-            </w:r>
+              <w:t xml:space="preserve">Metode </w:t>
+            </w:r>
+            <w:proofErr w:type="spellStart"/>
+            <w:r>
+              <w:rPr>
+                <w:rFonts w:ascii="Arial" w:hAnsi="Arial" w:cs="Arial"/>
+                <w:sz w:val="18"/>
+                <w:szCs w:val="18"/>
+                <w:highlight w:val="yellow"/>
+                <w:lang w:val="en-US"/>
+              </w:rPr>
+              <w:t>Kerja</w:t>
+            </w:r>
+            <w:proofErr w:type="spellEnd"/>
           </w:p>
         </w:tc>
         <w:tc>
@@ -9569,6 +10148,7 @@
                 <w:lang w:val="en-US"/>
               </w:rPr>
             </w:pPr>
+            <w:proofErr w:type="spellStart"/>
             <w:r>
               <w:rPr>
                 <w:rFonts w:ascii="Arial" w:hAnsi="Arial" w:cs="Arial"/>
@@ -9577,7 +10157,18 @@
                 <w:highlight w:val="yellow"/>
                 <w:lang w:val="en-US"/>
               </w:rPr>
-              <w:t>Analisis HSD</w:t>
+              <w:t>Analisis</w:t>
+            </w:r>
+            <w:proofErr w:type="spellEnd"/>
+            <w:r>
+              <w:rPr>
+                <w:rFonts w:ascii="Arial" w:hAnsi="Arial" w:cs="Arial"/>
+                <w:sz w:val="18"/>
+                <w:szCs w:val="18"/>
+                <w:highlight w:val="yellow"/>
+                <w:lang w:val="en-US"/>
+              </w:rPr>
+              <w:t xml:space="preserve"> HSD</w:t>
             </w:r>
           </w:p>
         </w:tc>
@@ -9963,6 +10554,7 @@
                 <w:lang w:val="en-US"/>
               </w:rPr>
             </w:pPr>
+            <w:proofErr w:type="spellStart"/>
             <w:r>
               <w:rPr>
                 <w:rFonts w:ascii="Arial" w:hAnsi="Arial" w:cs="Arial"/>
@@ -9975,6 +10567,7 @@
               </w:rPr>
               <w:t>Rekapitulasi</w:t>
             </w:r>
+            <w:proofErr w:type="spellEnd"/>
           </w:p>
         </w:tc>
         <w:tc>
@@ -10053,8 +10646,20 @@
                 <w:highlight w:val="yellow"/>
                 <w:lang w:val="en-US"/>
               </w:rPr>
-              <w:t>Tenaga Kerja</w:t>
-            </w:r>
+              <w:t xml:space="preserve">Tenaga </w:t>
+            </w:r>
+            <w:proofErr w:type="spellStart"/>
+            <w:r>
+              <w:rPr>
+                <w:rFonts w:ascii="Arial" w:hAnsi="Arial" w:cs="Arial"/>
+                <w:sz w:val="18"/>
+                <w:szCs w:val="18"/>
+                <w:highlight w:val="yellow"/>
+                <w:lang w:val="en-US"/>
+              </w:rPr>
+              <w:t>Kerja</w:t>
+            </w:r>
+            <w:proofErr w:type="spellEnd"/>
           </w:p>
         </w:tc>
         <w:tc>
@@ -10218,6 +10823,7 @@
                 <w:lang w:val="en-US"/>
               </w:rPr>
             </w:pPr>
+            <w:proofErr w:type="spellStart"/>
             <w:r>
               <w:rPr>
                 <w:rFonts w:ascii="Arial" w:hAnsi="Arial" w:cs="Arial"/>
@@ -10228,6 +10834,7 @@
               </w:rPr>
               <w:t>Peralatan</w:t>
             </w:r>
+            <w:proofErr w:type="spellEnd"/>
           </w:p>
         </w:tc>
         <w:tc>
@@ -11120,20 +11727,29 @@
                 <w:highlight w:val="yellow"/>
               </w:rPr>
             </w:pPr>
-            <w:r>
+          </w:p>
+        </w:tc>
+        <w:tc>
+          <w:tcPr>
+            <w:tcW w:w="2835" w:type="dxa"/>
+            <w:vAlign w:val="center"/>
+          </w:tcPr>
+          <w:p>
+            <w:pPr>
+              <w:spacing w:line="276" w:lineRule="auto"/>
+              <w:jc w:val="both"/>
               <w:rPr>
                 <w:rFonts w:ascii="Arial" w:eastAsia="Arial" w:hAnsi="Arial" w:cs="Arial"/>
                 <w:sz w:val="18"/>
                 <w:szCs w:val="18"/>
                 <w:highlight w:val="yellow"/>
               </w:rPr>
-              <w:t>1.1</w:t>
-            </w:r>
-          </w:p>
-        </w:tc>
-        <w:tc>
-          <w:tcPr>
-            <w:tcW w:w="2835" w:type="dxa"/>
+            </w:pPr>
+          </w:p>
+        </w:tc>
+        <w:tc>
+          <w:tcPr>
+            <w:tcW w:w="3401" w:type="dxa"/>
             <w:vAlign w:val="center"/>
           </w:tcPr>
           <w:p>
@@ -11147,79 +11763,23 @@
                 <w:highlight w:val="yellow"/>
               </w:rPr>
             </w:pPr>
-            <w:r>
+          </w:p>
+        </w:tc>
+        <w:tc>
+          <w:tcPr>
+            <w:tcW w:w="1609" w:type="dxa"/>
+            <w:vAlign w:val="center"/>
+          </w:tcPr>
+          <w:p>
+            <w:pPr>
+              <w:spacing w:line="276" w:lineRule="auto"/>
+              <w:jc w:val="center"/>
               <w:rPr>
                 <w:rFonts w:ascii="Arial" w:eastAsia="Arial" w:hAnsi="Arial" w:cs="Arial"/>
                 <w:sz w:val="18"/>
                 <w:szCs w:val="18"/>
                 <w:highlight w:val="yellow"/>
-              </w:rPr>
-              <w:t>tidak terdapat kesalahan aritmatik/perhitungan dalam penyusunan HPS (seperti kesalahan perkalian, kesalahan formula, kesalahan pengetikan dan sebagainya)</w:t>
-            </w:r>
-          </w:p>
-        </w:tc>
-        <w:tc>
-          <w:tcPr>
-            <w:tcW w:w="3401" w:type="dxa"/>
-            <w:vAlign w:val="center"/>
-          </w:tcPr>
-          <w:p>
-            <w:pPr>
-              <w:spacing w:line="276" w:lineRule="auto"/>
-              <w:jc w:val="both"/>
-              <w:rPr>
-                <w:rFonts w:ascii="Arial" w:hAnsi="Arial" w:cs="Arial"/>
-                <w:sz w:val="18"/>
-                <w:szCs w:val="18"/>
-                <w:highlight w:val="yellow"/>
-              </w:rPr>
-            </w:pPr>
-            <w:r>
-              <w:rPr>
-                <w:rFonts w:ascii="Arial" w:hAnsi="Arial" w:cs="Arial"/>
-                <w:sz w:val="18"/>
-                <w:szCs w:val="18"/>
-                <w:highlight w:val="yellow"/>
-              </w:rPr>
-              <w:t>Bagian 2.2.2 Lampiran II Per LKPP 12/2021</w:t>
-            </w:r>
-          </w:p>
-          <w:p>
-            <w:pPr>
-              <w:spacing w:line="276" w:lineRule="auto"/>
-              <w:jc w:val="both"/>
-              <w:rPr>
-                <w:rFonts w:ascii="Arial" w:eastAsia="Arial" w:hAnsi="Arial" w:cs="Arial"/>
-                <w:sz w:val="18"/>
-                <w:szCs w:val="18"/>
-                <w:highlight w:val="yellow"/>
-              </w:rPr>
-            </w:pPr>
-            <w:r>
-              <w:rPr>
-                <w:rFonts w:ascii="Arial" w:hAnsi="Arial" w:cs="Arial"/>
-                <w:sz w:val="18"/>
-                <w:szCs w:val="18"/>
-                <w:highlight w:val="yellow"/>
-              </w:rPr>
-              <w:t>HPS dihitung secara keahlian dan menggunakan data/informasi yang dapat dipertanggungjawabkan</w:t>
-            </w:r>
-          </w:p>
-        </w:tc>
-        <w:tc>
-          <w:tcPr>
-            <w:tcW w:w="1609" w:type="dxa"/>
-            <w:vAlign w:val="center"/>
-          </w:tcPr>
-          <w:p>
-            <w:pPr>
-              <w:spacing w:line="276" w:lineRule="auto"/>
-              <w:jc w:val="center"/>
-              <w:rPr>
-                <w:rFonts w:ascii="Arial" w:eastAsia="Arial" w:hAnsi="Arial" w:cs="Arial"/>
-                <w:sz w:val="18"/>
-                <w:szCs w:val="18"/>
-                <w:highlight w:val="yellow"/>
+                <w:lang w:val="en-US"/>
               </w:rPr>
             </w:pPr>
             <w:r>
@@ -11454,52 +12014,12 @@
               <w:spacing w:line="276" w:lineRule="auto"/>
               <w:jc w:val="both"/>
               <w:rPr>
-                <w:rFonts w:ascii="Arial" w:hAnsi="Arial" w:cs="Arial"/>
-                <w:sz w:val="18"/>
-                <w:szCs w:val="18"/>
-                <w:highlight w:val="yellow"/>
-              </w:rPr>
-            </w:pPr>
-            <w:r>
-              <w:rPr>
-                <w:rFonts w:ascii="Arial" w:hAnsi="Arial" w:cs="Arial"/>
-                <w:sz w:val="18"/>
-                <w:szCs w:val="18"/>
-                <w:highlight w:val="yellow"/>
-              </w:rPr>
-              <w:t>Bagian 2.2.2 Lampiran II Per LKPP 12/2021</w:t>
-            </w:r>
-          </w:p>
-          <w:p>
-            <w:pPr>
-              <w:spacing w:line="276" w:lineRule="auto"/>
-              <w:jc w:val="both"/>
-              <w:rPr>
                 <w:rFonts w:ascii="Arial" w:eastAsia="Arial" w:hAnsi="Arial" w:cs="Arial"/>
                 <w:sz w:val="18"/>
                 <w:szCs w:val="18"/>
                 <w:highlight w:val="yellow"/>
               </w:rPr>
             </w:pPr>
-            <w:r>
-              <w:rPr>
-                <w:rFonts w:ascii="Arial" w:hAnsi="Arial" w:cs="Arial"/>
-                <w:sz w:val="18"/>
-                <w:szCs w:val="18"/>
-                <w:highlight w:val="yellow"/>
-              </w:rPr>
-              <w:t xml:space="preserve">Nilai HPS bersifat terbuka dan tidak rahasia serta paling tinggi sama dengan nilai pagu anggaran, sedangkan rincian HPS bersifat rahasia, kecuali rincian harga satuan tersebut telah tercantum dalam Dokumen Anggaran BelanjaHPS dihitung secara keahlian dan </w:t>
-            </w:r>
-            <w:r>
-              <w:rPr>
-                <w:rFonts w:ascii="Arial" w:hAnsi="Arial" w:cs="Arial"/>
-                <w:sz w:val="18"/>
-                <w:szCs w:val="18"/>
-                <w:highlight w:val="yellow"/>
-              </w:rPr>
-              <w:lastRenderedPageBreak/>
-              <w:t>menggunakan data/informasi yang dapat dipertanggungjawabkan.</w:t>
-            </w:r>
           </w:p>
         </w:tc>
         <w:tc>
@@ -11525,7 +12045,6 @@
                 <w:szCs w:val="18"/>
                 <w:highlight w:val="yellow"/>
               </w:rPr>
-              <w:lastRenderedPageBreak/>
               <w:t>Memenuhi</w:t>
             </w:r>
           </w:p>
@@ -11751,126 +12270,12 @@
               <w:spacing w:line="276" w:lineRule="auto"/>
               <w:jc w:val="both"/>
               <w:rPr>
-                <w:rFonts w:ascii="Arial" w:hAnsi="Arial" w:cs="Arial"/>
-                <w:sz w:val="18"/>
-                <w:szCs w:val="18"/>
-                <w:highlight w:val="yellow"/>
-              </w:rPr>
-            </w:pPr>
-            <w:r>
-              <w:rPr>
-                <w:rFonts w:ascii="Arial" w:hAnsi="Arial" w:cs="Arial"/>
-                <w:sz w:val="18"/>
-                <w:szCs w:val="18"/>
-                <w:highlight w:val="yellow"/>
-              </w:rPr>
-              <w:t>Paragraf 2 Pasal 21 ayat (3) Permen PUPR 10/2021</w:t>
-            </w:r>
-          </w:p>
-          <w:p>
-            <w:pPr>
-              <w:spacing w:line="276" w:lineRule="auto"/>
-              <w:jc w:val="both"/>
-              <w:rPr>
-                <w:rFonts w:ascii="Arial" w:hAnsi="Arial" w:cs="Arial"/>
-                <w:sz w:val="18"/>
-                <w:szCs w:val="18"/>
-                <w:highlight w:val="yellow"/>
-              </w:rPr>
-            </w:pPr>
-            <w:r>
-              <w:rPr>
-                <w:rFonts w:ascii="Arial" w:hAnsi="Arial" w:cs="Arial"/>
-                <w:sz w:val="18"/>
-                <w:szCs w:val="18"/>
-                <w:highlight w:val="yellow"/>
-              </w:rPr>
-              <w:t>Dokumen pemilihan sebagaimana dimaksud pada ayat (1) harus memuat:</w:t>
-            </w:r>
-          </w:p>
-          <w:p>
-            <w:pPr>
-              <w:spacing w:line="276" w:lineRule="auto"/>
-              <w:jc w:val="both"/>
-              <w:rPr>
-                <w:rFonts w:ascii="Arial" w:hAnsi="Arial" w:cs="Arial"/>
-                <w:sz w:val="18"/>
-                <w:szCs w:val="18"/>
-                <w:highlight w:val="yellow"/>
-              </w:rPr>
-            </w:pPr>
-            <w:r>
-              <w:rPr>
-                <w:rFonts w:ascii="Arial" w:hAnsi="Arial" w:cs="Arial"/>
-                <w:sz w:val="18"/>
-                <w:szCs w:val="18"/>
-                <w:highlight w:val="yellow"/>
-              </w:rPr>
-              <w:t>a. Manajemen Risiko Keselamatan Konstruksi yang paling sedikit memuat uraian pekerjaan, identifikasi bahaya, dan penetapan tingkat Risiko Keselamatan Konstruksi pada Pekerjaan Konstruksi; dan</w:t>
-            </w:r>
-          </w:p>
-          <w:p>
-            <w:pPr>
-              <w:spacing w:line="276" w:lineRule="auto"/>
-              <w:jc w:val="both"/>
-              <w:rPr>
-                <w:rFonts w:ascii="Arial" w:hAnsi="Arial" w:cs="Arial"/>
-                <w:sz w:val="18"/>
-                <w:szCs w:val="18"/>
-                <w:highlight w:val="yellow"/>
-              </w:rPr>
-            </w:pPr>
-            <w:r>
-              <w:rPr>
-                <w:rFonts w:ascii="Arial" w:hAnsi="Arial" w:cs="Arial"/>
-                <w:sz w:val="18"/>
-                <w:szCs w:val="18"/>
-                <w:highlight w:val="yellow"/>
-              </w:rPr>
-              <w:t>b. Biaya Penerapan SMKK pada HPS</w:t>
-            </w:r>
-          </w:p>
-          <w:p>
-            <w:pPr>
-              <w:spacing w:line="276" w:lineRule="auto"/>
-              <w:jc w:val="both"/>
-              <w:rPr>
-                <w:rFonts w:ascii="Arial" w:hAnsi="Arial" w:cs="Arial"/>
-                <w:sz w:val="18"/>
-                <w:szCs w:val="18"/>
-                <w:highlight w:val="yellow"/>
-              </w:rPr>
-            </w:pPr>
-            <w:r>
-              <w:rPr>
-                <w:rFonts w:ascii="Arial" w:hAnsi="Arial" w:cs="Arial"/>
-                <w:sz w:val="18"/>
-                <w:szCs w:val="18"/>
-                <w:highlight w:val="yellow"/>
-              </w:rPr>
-              <w:t>Bagian 3.1 Lampiran II Per LKPP 12/2021</w:t>
-            </w:r>
-          </w:p>
-          <w:p>
-            <w:pPr>
-              <w:spacing w:line="276" w:lineRule="auto"/>
-              <w:jc w:val="both"/>
-              <w:rPr>
                 <w:rFonts w:ascii="Arial" w:eastAsia="Arial" w:hAnsi="Arial" w:cs="Arial"/>
                 <w:sz w:val="18"/>
                 <w:szCs w:val="18"/>
                 <w:highlight w:val="yellow"/>
               </w:rPr>
             </w:pPr>
-            <w:r>
-              <w:rPr>
-                <w:rFonts w:ascii="Arial" w:hAnsi="Arial" w:cs="Arial"/>
-                <w:sz w:val="18"/>
-                <w:szCs w:val="18"/>
-                <w:highlight w:val="yellow"/>
-              </w:rPr>
-              <w:t>Pokja Pemilihan juga memeriksa pemenuhan perhitungan kewajiban perpajakan/cukai/asuransi/ SMK3 atau biaya lain yang dipersyaratkan dalam pelaksanaan pekerjaan.</w:t>
-            </w:r>
           </w:p>
         </w:tc>
         <w:tc>
@@ -12073,7 +12478,7 @@
       </w:tr>
       <w:tr>
         <w:trPr>
-          <w:trHeight w:val="1280"/>
+          <w:trHeight w:val="314"/>
         </w:trPr>
         <w:tc>
           <w:tcPr>
@@ -12127,36 +12532,6 @@
                 <w:highlight w:val="yellow"/>
               </w:rPr>
             </w:pPr>
-            <w:r>
-              <w:rPr>
-                <w:rFonts w:ascii="Arial" w:eastAsia="Arial" w:hAnsi="Arial" w:cs="Arial"/>
-                <w:sz w:val="18"/>
-                <w:szCs w:val="18"/>
-                <w:highlight w:val="yellow"/>
-              </w:rPr>
-              <w:t>Bagian 3.1 huruf c Lampiran II Per LKPP 12/2021</w:t>
-            </w:r>
-          </w:p>
-          <w:p>
-            <w:pPr>
-              <w:spacing w:line="276" w:lineRule="auto"/>
-              <w:jc w:val="both"/>
-              <w:rPr>
-                <w:rFonts w:ascii="Arial" w:eastAsia="Arial" w:hAnsi="Arial" w:cs="Arial"/>
-                <w:sz w:val="18"/>
-                <w:szCs w:val="18"/>
-                <w:highlight w:val="yellow"/>
-              </w:rPr>
-            </w:pPr>
-            <w:r>
-              <w:rPr>
-                <w:rFonts w:ascii="Arial" w:eastAsia="Arial" w:hAnsi="Arial" w:cs="Arial"/>
-                <w:sz w:val="18"/>
-                <w:szCs w:val="18"/>
-                <w:highlight w:val="yellow"/>
-              </w:rPr>
-              <w:t>komponen/unsur pembayaran pada uraian pekerjaan agar sesuai dengan KAK, spesifikasi teknis dan detailed engineering design dan ruang lingkup pekerjaan.</w:t>
-            </w:r>
           </w:p>
         </w:tc>
         <w:tc>
@@ -12431,36 +12806,6 @@
                 <w:highlight w:val="yellow"/>
               </w:rPr>
             </w:pPr>
-            <w:r>
-              <w:rPr>
-                <w:rFonts w:ascii="Arial" w:eastAsia="Arial" w:hAnsi="Arial" w:cs="Arial"/>
-                <w:sz w:val="18"/>
-                <w:szCs w:val="18"/>
-                <w:highlight w:val="yellow"/>
-              </w:rPr>
-              <w:t>Bagian 2.2.2 Lampiran II Per LKPP 12/2021</w:t>
-            </w:r>
-          </w:p>
-          <w:p>
-            <w:pPr>
-              <w:spacing w:line="276" w:lineRule="auto"/>
-              <w:jc w:val="both"/>
-              <w:rPr>
-                <w:rFonts w:ascii="Arial" w:eastAsia="Arial" w:hAnsi="Arial" w:cs="Arial"/>
-                <w:sz w:val="18"/>
-                <w:szCs w:val="18"/>
-                <w:highlight w:val="yellow"/>
-              </w:rPr>
-            </w:pPr>
-            <w:r>
-              <w:rPr>
-                <w:rFonts w:ascii="Arial" w:eastAsia="Arial" w:hAnsi="Arial" w:cs="Arial"/>
-                <w:sz w:val="18"/>
-                <w:szCs w:val="18"/>
-                <w:highlight w:val="yellow"/>
-              </w:rPr>
-              <w:t>HPS dihitung secara keahlian dan menggunakan data/informasi yang dapat dipertanggungjawabkan</w:t>
-            </w:r>
           </w:p>
         </w:tc>
         <w:tc>
@@ -12608,7 +12953,6 @@
         <w:tc>
           <w:tcPr>
             <w:tcW w:w="568" w:type="dxa"/>
-            <w:shd w:val="clear" w:color="auto" w:fill="D9D9D9" w:themeFill="background1" w:themeFillShade="D9"/>
             <w:vAlign w:val="center"/>
           </w:tcPr>
           <w:p>
@@ -12628,37 +12972,160 @@
                 <w:sz w:val="18"/>
                 <w:szCs w:val="18"/>
                 <w:highlight w:val="yellow"/>
-              </w:rPr>
-              <w:t>6</w:t>
-            </w:r>
-          </w:p>
-        </w:tc>
-        <w:tc>
-          <w:tcPr>
-            <w:tcW w:w="14824" w:type="dxa"/>
-            <w:gridSpan w:val="7"/>
-            <w:shd w:val="clear" w:color="auto" w:fill="D9D9D9" w:themeFill="background1" w:themeFillShade="D9"/>
-            <w:vAlign w:val="center"/>
-          </w:tcPr>
-          <w:p>
-            <w:pPr>
-              <w:spacing w:line="276" w:lineRule="auto"/>
-              <w:rPr>
-                <w:rFonts w:ascii="Arial" w:hAnsi="Arial" w:cs="Arial"/>
-                <w:sz w:val="18"/>
-                <w:szCs w:val="18"/>
-                <w:highlight w:val="yellow"/>
-              </w:rPr>
-            </w:pPr>
-            <w:r>
+                <w:lang w:val="en-US"/>
+              </w:rPr>
+              <w:t>5.2</w:t>
+            </w:r>
+          </w:p>
+        </w:tc>
+        <w:tc>
+          <w:tcPr>
+            <w:tcW w:w="2835" w:type="dxa"/>
+            <w:vAlign w:val="center"/>
+          </w:tcPr>
+          <w:p>
+            <w:pPr>
+              <w:spacing w:line="276" w:lineRule="auto"/>
+              <w:jc w:val="both"/>
               <w:rPr>
                 <w:rFonts w:ascii="Arial" w:eastAsia="Arial" w:hAnsi="Arial" w:cs="Arial"/>
                 <w:sz w:val="18"/>
                 <w:szCs w:val="18"/>
                 <w:highlight w:val="yellow"/>
               </w:rPr>
-              <w:t>HPS ditetapkan sesuai dengan ketentuan pengadaan barang/jasa, mencakup</w:t>
-            </w:r>
+            </w:pPr>
+            <w:r>
+              <w:rPr>
+                <w:rFonts w:ascii="Arial" w:eastAsia="Arial" w:hAnsi="Arial" w:cs="Arial"/>
+                <w:sz w:val="18"/>
+                <w:szCs w:val="18"/>
+                <w:highlight w:val="yellow"/>
+                <w:lang w:val="en-US"/>
+              </w:rPr>
+              <w:t>Material</w:t>
+            </w:r>
+          </w:p>
+        </w:tc>
+        <w:tc>
+          <w:tcPr>
+            <w:tcW w:w="3401" w:type="dxa"/>
+            <w:vAlign w:val="center"/>
+          </w:tcPr>
+          <w:p>
+            <w:pPr>
+              <w:spacing w:line="276" w:lineRule="auto"/>
+              <w:jc w:val="both"/>
+              <w:rPr>
+                <w:rFonts w:ascii="Arial" w:eastAsia="Arial" w:hAnsi="Arial" w:cs="Arial"/>
+                <w:sz w:val="18"/>
+                <w:szCs w:val="18"/>
+                <w:highlight w:val="yellow"/>
+              </w:rPr>
+            </w:pPr>
+          </w:p>
+        </w:tc>
+        <w:tc>
+          <w:tcPr>
+            <w:tcW w:w="1609" w:type="dxa"/>
+            <w:vAlign w:val="center"/>
+          </w:tcPr>
+          <w:p>
+            <w:pPr>
+              <w:spacing w:line="276" w:lineRule="auto"/>
+              <w:jc w:val="center"/>
+              <w:rPr>
+                <w:rFonts w:ascii="Arial" w:hAnsi="Arial" w:cs="Arial"/>
+                <w:sz w:val="18"/>
+                <w:szCs w:val="18"/>
+                <w:highlight w:val="yellow"/>
+              </w:rPr>
+            </w:pPr>
+            <w:proofErr w:type="spellStart"/>
+            <w:r>
+              <w:rPr>
+                <w:rFonts w:ascii="Arial" w:hAnsi="Arial" w:cs="Arial"/>
+                <w:sz w:val="18"/>
+                <w:szCs w:val="18"/>
+                <w:highlight w:val="yellow"/>
+                <w:lang w:val="en-US"/>
+              </w:rPr>
+              <w:t>Memenuhi</w:t>
+            </w:r>
+            <w:proofErr w:type="spellEnd"/>
+          </w:p>
+        </w:tc>
+        <w:tc>
+          <w:tcPr>
+            <w:tcW w:w="1749" w:type="dxa"/>
+            <w:vAlign w:val="center"/>
+          </w:tcPr>
+          <w:p>
+            <w:pPr>
+              <w:spacing w:line="276" w:lineRule="auto"/>
+              <w:jc w:val="center"/>
+              <w:rPr>
+                <w:rFonts w:ascii="Arial" w:hAnsi="Arial" w:cs="Arial"/>
+                <w:sz w:val="18"/>
+                <w:szCs w:val="18"/>
+                <w:highlight w:val="yellow"/>
+              </w:rPr>
+            </w:pPr>
+          </w:p>
+        </w:tc>
+        <w:tc>
+          <w:tcPr>
+            <w:tcW w:w="1745" w:type="dxa"/>
+            <w:vAlign w:val="center"/>
+          </w:tcPr>
+          <w:p>
+            <w:pPr>
+              <w:spacing w:line="276" w:lineRule="auto"/>
+              <w:jc w:val="center"/>
+              <w:rPr>
+                <w:rFonts w:ascii="Arial" w:hAnsi="Arial" w:cs="Arial"/>
+                <w:sz w:val="18"/>
+                <w:szCs w:val="18"/>
+                <w:highlight w:val="yellow"/>
+              </w:rPr>
+            </w:pPr>
+          </w:p>
+        </w:tc>
+        <w:tc>
+          <w:tcPr>
+            <w:tcW w:w="1701" w:type="dxa"/>
+            <w:vAlign w:val="center"/>
+          </w:tcPr>
+          <w:p>
+            <w:pPr>
+              <w:pStyle w:val="ListParagraph"/>
+              <w:spacing w:line="276" w:lineRule="auto"/>
+              <w:ind w:left="0"/>
+              <w:jc w:val="center"/>
+              <w:rPr>
+                <w:rFonts w:ascii="Arial" w:hAnsi="Arial" w:cs="Arial"/>
+                <w:sz w:val="18"/>
+                <w:szCs w:val="18"/>
+                <w:highlight w:val="yellow"/>
+              </w:rPr>
+            </w:pPr>
+          </w:p>
+        </w:tc>
+        <w:tc>
+          <w:tcPr>
+            <w:tcW w:w="1784" w:type="dxa"/>
+            <w:vAlign w:val="center"/>
+          </w:tcPr>
+          <w:p>
+            <w:pPr>
+              <w:spacing w:line="276" w:lineRule="auto"/>
+              <w:jc w:val="center"/>
+              <w:rPr>
+                <w:rFonts w:ascii="Arial" w:hAnsi="Arial" w:cs="Arial"/>
+                <w:sz w:val="18"/>
+                <w:szCs w:val="18"/>
+                <w:highlight w:val="yellow"/>
+              </w:rPr>
+            </w:pPr>
           </w:p>
         </w:tc>
       </w:tr>
@@ -12680,6 +13147,7 @@
                 <w:sz w:val="18"/>
                 <w:szCs w:val="18"/>
                 <w:highlight w:val="yellow"/>
+                <w:lang w:val="en-US"/>
               </w:rPr>
             </w:pPr>
             <w:r>
@@ -12688,8 +13156,275 @@
                 <w:sz w:val="18"/>
                 <w:szCs w:val="18"/>
                 <w:highlight w:val="yellow"/>
-              </w:rPr>
-              <w:lastRenderedPageBreak/>
+                <w:lang w:val="en-US"/>
+              </w:rPr>
+              <w:t xml:space="preserve">5.3 </w:t>
+            </w:r>
+          </w:p>
+        </w:tc>
+        <w:tc>
+          <w:tcPr>
+            <w:tcW w:w="2835" w:type="dxa"/>
+            <w:vAlign w:val="center"/>
+          </w:tcPr>
+          <w:p>
+            <w:pPr>
+              <w:spacing w:line="276" w:lineRule="auto"/>
+              <w:jc w:val="both"/>
+              <w:rPr>
+                <w:rFonts w:ascii="Arial" w:eastAsia="Arial" w:hAnsi="Arial" w:cs="Arial"/>
+                <w:sz w:val="18"/>
+                <w:szCs w:val="18"/>
+                <w:highlight w:val="yellow"/>
+                <w:lang w:val="en-US"/>
+              </w:rPr>
+            </w:pPr>
+            <w:proofErr w:type="spellStart"/>
+            <w:r>
+              <w:rPr>
+                <w:rFonts w:ascii="Arial" w:eastAsia="Arial" w:hAnsi="Arial" w:cs="Arial"/>
+                <w:sz w:val="18"/>
+                <w:szCs w:val="18"/>
+                <w:highlight w:val="yellow"/>
+                <w:lang w:val="en-US"/>
+              </w:rPr>
+              <w:t>Peralatan</w:t>
+            </w:r>
+            <w:proofErr w:type="spellEnd"/>
+          </w:p>
+        </w:tc>
+        <w:tc>
+          <w:tcPr>
+            <w:tcW w:w="3401" w:type="dxa"/>
+            <w:vAlign w:val="center"/>
+          </w:tcPr>
+          <w:p>
+            <w:pPr>
+              <w:spacing w:line="276" w:lineRule="auto"/>
+              <w:jc w:val="both"/>
+              <w:rPr>
+                <w:rFonts w:ascii="Arial" w:eastAsia="Arial" w:hAnsi="Arial" w:cs="Arial"/>
+                <w:sz w:val="18"/>
+                <w:szCs w:val="18"/>
+                <w:highlight w:val="yellow"/>
+              </w:rPr>
+            </w:pPr>
+          </w:p>
+        </w:tc>
+        <w:tc>
+          <w:tcPr>
+            <w:tcW w:w="1609" w:type="dxa"/>
+            <w:vAlign w:val="center"/>
+          </w:tcPr>
+          <w:p>
+            <w:pPr>
+              <w:spacing w:line="276" w:lineRule="auto"/>
+              <w:jc w:val="center"/>
+              <w:rPr>
+                <w:rFonts w:ascii="Arial" w:hAnsi="Arial" w:cs="Arial"/>
+                <w:sz w:val="18"/>
+                <w:szCs w:val="18"/>
+                <w:highlight w:val="yellow"/>
+                <w:lang w:val="en-US"/>
+              </w:rPr>
+            </w:pPr>
+            <w:r>
+              <w:rPr>
+                <w:rFonts w:ascii="Arial" w:hAnsi="Arial" w:cs="Arial"/>
+                <w:sz w:val="18"/>
+                <w:szCs w:val="18"/>
+                <w:highlight w:val="yellow"/>
+                <w:lang w:val="en-US"/>
+              </w:rPr>
+              <w:t xml:space="preserve">Tidak </w:t>
+            </w:r>
+            <w:proofErr w:type="spellStart"/>
+            <w:r>
+              <w:rPr>
+                <w:rFonts w:ascii="Arial" w:hAnsi="Arial" w:cs="Arial"/>
+                <w:sz w:val="18"/>
+                <w:szCs w:val="18"/>
+                <w:highlight w:val="yellow"/>
+                <w:lang w:val="en-US"/>
+              </w:rPr>
+              <w:t>Memenuhi</w:t>
+            </w:r>
+            <w:proofErr w:type="spellEnd"/>
+            <w:r>
+              <w:rPr>
+                <w:rFonts w:ascii="Arial" w:hAnsi="Arial" w:cs="Arial"/>
+                <w:sz w:val="18"/>
+                <w:szCs w:val="18"/>
+                <w:highlight w:val="yellow"/>
+                <w:lang w:val="en-US"/>
+              </w:rPr>
+              <w:t xml:space="preserve"> </w:t>
+            </w:r>
+          </w:p>
+        </w:tc>
+        <w:tc>
+          <w:tcPr>
+            <w:tcW w:w="1749" w:type="dxa"/>
+            <w:vAlign w:val="center"/>
+          </w:tcPr>
+          <w:p>
+            <w:pPr>
+              <w:spacing w:line="276" w:lineRule="auto"/>
+              <w:jc w:val="center"/>
+              <w:rPr>
+                <w:rFonts w:ascii="Arial" w:hAnsi="Arial" w:cs="Arial"/>
+                <w:sz w:val="18"/>
+                <w:szCs w:val="18"/>
+                <w:highlight w:val="yellow"/>
+              </w:rPr>
+            </w:pPr>
+          </w:p>
+        </w:tc>
+        <w:tc>
+          <w:tcPr>
+            <w:tcW w:w="1745" w:type="dxa"/>
+            <w:vAlign w:val="center"/>
+          </w:tcPr>
+          <w:p>
+            <w:pPr>
+              <w:spacing w:line="276" w:lineRule="auto"/>
+              <w:jc w:val="center"/>
+              <w:rPr>
+                <w:rFonts w:ascii="Arial" w:hAnsi="Arial" w:cs="Arial"/>
+                <w:sz w:val="18"/>
+                <w:szCs w:val="18"/>
+                <w:highlight w:val="yellow"/>
+              </w:rPr>
+            </w:pPr>
+          </w:p>
+        </w:tc>
+        <w:tc>
+          <w:tcPr>
+            <w:tcW w:w="1701" w:type="dxa"/>
+            <w:vAlign w:val="center"/>
+          </w:tcPr>
+          <w:p>
+            <w:pPr>
+              <w:pStyle w:val="ListParagraph"/>
+              <w:spacing w:line="276" w:lineRule="auto"/>
+              <w:ind w:left="0"/>
+              <w:jc w:val="center"/>
+              <w:rPr>
+                <w:rFonts w:ascii="Arial" w:hAnsi="Arial" w:cs="Arial"/>
+                <w:sz w:val="18"/>
+                <w:szCs w:val="18"/>
+                <w:highlight w:val="yellow"/>
+              </w:rPr>
+            </w:pPr>
+          </w:p>
+        </w:tc>
+        <w:tc>
+          <w:tcPr>
+            <w:tcW w:w="1784" w:type="dxa"/>
+            <w:vAlign w:val="center"/>
+          </w:tcPr>
+          <w:p>
+            <w:pPr>
+              <w:spacing w:line="276" w:lineRule="auto"/>
+              <w:jc w:val="center"/>
+              <w:rPr>
+                <w:rFonts w:ascii="Arial" w:hAnsi="Arial" w:cs="Arial"/>
+                <w:sz w:val="18"/>
+                <w:szCs w:val="18"/>
+                <w:highlight w:val="yellow"/>
+              </w:rPr>
+            </w:pPr>
+          </w:p>
+        </w:tc>
+      </w:tr>
+      <w:tr>
+        <w:trPr>
+          <w:trHeight w:val="284"/>
+        </w:trPr>
+        <w:tc>
+          <w:tcPr>
+            <w:tcW w:w="568" w:type="dxa"/>
+            <w:shd w:val="clear" w:color="auto" w:fill="D9D9D9" w:themeFill="background1" w:themeFillShade="D9"/>
+            <w:vAlign w:val="center"/>
+          </w:tcPr>
+          <w:p>
+            <w:pPr>
+              <w:spacing w:line="276" w:lineRule="auto"/>
+              <w:jc w:val="center"/>
+              <w:rPr>
+                <w:rFonts w:ascii="Arial" w:eastAsia="Arial" w:hAnsi="Arial" w:cs="Arial"/>
+                <w:sz w:val="18"/>
+                <w:szCs w:val="18"/>
+                <w:highlight w:val="yellow"/>
+              </w:rPr>
+            </w:pPr>
+            <w:r>
+              <w:rPr>
+                <w:rFonts w:ascii="Arial" w:eastAsia="Arial" w:hAnsi="Arial" w:cs="Arial"/>
+                <w:sz w:val="18"/>
+                <w:szCs w:val="18"/>
+                <w:highlight w:val="yellow"/>
+              </w:rPr>
+              <w:t>6</w:t>
+            </w:r>
+          </w:p>
+        </w:tc>
+        <w:tc>
+          <w:tcPr>
+            <w:tcW w:w="14824" w:type="dxa"/>
+            <w:gridSpan w:val="7"/>
+            <w:shd w:val="clear" w:color="auto" w:fill="D9D9D9" w:themeFill="background1" w:themeFillShade="D9"/>
+            <w:vAlign w:val="center"/>
+          </w:tcPr>
+          <w:p>
+            <w:pPr>
+              <w:spacing w:line="276" w:lineRule="auto"/>
+              <w:rPr>
+                <w:rFonts w:ascii="Arial" w:hAnsi="Arial" w:cs="Arial"/>
+                <w:sz w:val="18"/>
+                <w:szCs w:val="18"/>
+                <w:highlight w:val="yellow"/>
+              </w:rPr>
+            </w:pPr>
+            <w:r>
+              <w:rPr>
+                <w:rFonts w:ascii="Arial" w:eastAsia="Arial" w:hAnsi="Arial" w:cs="Arial"/>
+                <w:sz w:val="18"/>
+                <w:szCs w:val="18"/>
+                <w:highlight w:val="yellow"/>
+              </w:rPr>
+              <w:t>HPS ditetapkan sesuai dengan ketentuan pengadaan barang/jasa, mencakup</w:t>
+            </w:r>
+          </w:p>
+        </w:tc>
+      </w:tr>
+      <w:tr>
+        <w:trPr>
+          <w:trHeight w:val="284"/>
+        </w:trPr>
+        <w:tc>
+          <w:tcPr>
+            <w:tcW w:w="568" w:type="dxa"/>
+            <w:vAlign w:val="center"/>
+          </w:tcPr>
+          <w:p>
+            <w:pPr>
+              <w:spacing w:line="276" w:lineRule="auto"/>
+              <w:jc w:val="center"/>
+              <w:rPr>
+                <w:rFonts w:ascii="Arial" w:eastAsia="Arial" w:hAnsi="Arial" w:cs="Arial"/>
+                <w:sz w:val="18"/>
+                <w:szCs w:val="18"/>
+                <w:highlight w:val="yellow"/>
+              </w:rPr>
+            </w:pPr>
+            <w:r>
+              <w:rPr>
+                <w:rFonts w:ascii="Arial" w:eastAsia="Arial" w:hAnsi="Arial" w:cs="Arial"/>
+                <w:sz w:val="18"/>
+                <w:szCs w:val="18"/>
+                <w:highlight w:val="yellow"/>
+              </w:rPr>
               <w:t>6.1</w:t>
             </w:r>
           </w:p>
@@ -12737,36 +13472,6 @@
                 <w:highlight w:val="yellow"/>
               </w:rPr>
             </w:pPr>
-            <w:r>
-              <w:rPr>
-                <w:rFonts w:ascii="Arial" w:hAnsi="Arial" w:cs="Arial"/>
-                <w:sz w:val="18"/>
-                <w:szCs w:val="18"/>
-                <w:highlight w:val="yellow"/>
-              </w:rPr>
-              <w:t>Bagian 2.2.3 Lampiran II Per LKPP 12/2021</w:t>
-            </w:r>
-          </w:p>
-          <w:p>
-            <w:pPr>
-              <w:spacing w:line="276" w:lineRule="auto"/>
-              <w:jc w:val="both"/>
-              <w:rPr>
-                <w:rFonts w:ascii="Arial" w:hAnsi="Arial" w:cs="Arial"/>
-                <w:sz w:val="18"/>
-                <w:szCs w:val="18"/>
-                <w:highlight w:val="yellow"/>
-              </w:rPr>
-            </w:pPr>
-            <w:r>
-              <w:rPr>
-                <w:rFonts w:ascii="Arial" w:hAnsi="Arial" w:cs="Arial"/>
-                <w:sz w:val="18"/>
-                <w:szCs w:val="18"/>
-                <w:highlight w:val="yellow"/>
-              </w:rPr>
-              <w:t>PPK menetapkan HPS dengan menandatangani pada lembar persetujuan/penetapan. HPS yang sah adalah yang telah ditandatangani oleh PPK. Penetapan HPS paling lama 28 (dua puluh delapan) hari kerja sebelum batas akhir untuk: a. pemasukan penawaran untuk pemilihan dengan pascakualifikasi; atau b. pemasukan dokumen kualifikasi untuk pemilihan dengan prakualifikasi.</w:t>
-            </w:r>
           </w:p>
         </w:tc>
         <w:tc>
@@ -13088,26 +13793,33 @@
                 <w:sz w:val="18"/>
                 <w:szCs w:val="18"/>
                 <w:highlight w:val="yellow"/>
-              </w:rPr>
-            </w:pPr>
-            <w:r>
+                <w:lang w:val="en-US"/>
+              </w:rPr>
+            </w:pPr>
+          </w:p>
+          <w:p>
+            <w:pPr>
+              <w:spacing w:line="276" w:lineRule="auto"/>
+              <w:jc w:val="both"/>
               <w:rPr>
                 <w:rFonts w:ascii="Arial" w:eastAsia="Arial" w:hAnsi="Arial" w:cs="Arial"/>
                 <w:sz w:val="18"/>
                 <w:szCs w:val="18"/>
                 <w:highlight w:val="yellow"/>
               </w:rPr>
-              <w:t>Bukti dukung survey</w:t>
-            </w:r>
-            <w:r>
+            </w:pPr>
+          </w:p>
+          <w:p>
+            <w:pPr>
+              <w:spacing w:line="276" w:lineRule="auto"/>
+              <w:jc w:val="both"/>
               <w:rPr>
                 <w:rFonts w:ascii="Arial" w:eastAsia="Arial" w:hAnsi="Arial" w:cs="Arial"/>
                 <w:sz w:val="18"/>
                 <w:szCs w:val="18"/>
                 <w:highlight w:val="yellow"/>
               </w:rPr>
-              <w:t xml:space="preserve"> Tenaga Kerja Konstruksi </w:t>
-            </w:r>
+            </w:pPr>
             <w:r>
               <w:rPr>
                 <w:rFonts w:ascii="Arial" w:eastAsia="Arial" w:hAnsi="Arial" w:cs="Arial"/>
@@ -13115,70 +13827,19 @@
                 <w:szCs w:val="18"/>
                 <w:highlight w:val="yellow"/>
               </w:rPr>
-              <w:t xml:space="preserve">masih menggunakan </w:t>
-            </w:r>
-            <w:r>
+              <w:t>Rekomendasi:</w:t>
+            </w:r>
+          </w:p>
+          <w:p>
+            <w:pPr>
+              <w:spacing w:line="276" w:lineRule="auto"/>
+              <w:jc w:val="both"/>
               <w:rPr>
                 <w:rFonts w:ascii="Arial" w:eastAsia="Arial" w:hAnsi="Arial" w:cs="Arial"/>
                 <w:sz w:val="18"/>
                 <w:szCs w:val="18"/>
-                <w:highlight w:val="yellow"/>
-              </w:rPr>
-              <w:t>Upah Minimum Kabupaten/Kota (UMK)</w:t>
-            </w:r>
-          </w:p>
-          <w:p>
-            <w:pPr>
-              <w:spacing w:line="276" w:lineRule="auto"/>
-              <w:jc w:val="both"/>
-              <w:rPr>
-                <w:rFonts w:ascii="Arial" w:eastAsia="Arial" w:hAnsi="Arial" w:cs="Arial"/>
-                <w:sz w:val="18"/>
-                <w:szCs w:val="18"/>
-                <w:highlight w:val="yellow"/>
-              </w:rPr>
-            </w:pPr>
-          </w:p>
-          <w:p>
-            <w:pPr>
-              <w:spacing w:line="276" w:lineRule="auto"/>
-              <w:jc w:val="both"/>
-              <w:rPr>
-                <w:rFonts w:ascii="Arial" w:eastAsia="Arial" w:hAnsi="Arial" w:cs="Arial"/>
-                <w:sz w:val="18"/>
-                <w:szCs w:val="18"/>
-                <w:highlight w:val="yellow"/>
-              </w:rPr>
-            </w:pPr>
-            <w:r>
-              <w:rPr>
-                <w:rFonts w:ascii="Arial" w:eastAsia="Arial" w:hAnsi="Arial" w:cs="Arial"/>
-                <w:sz w:val="18"/>
-                <w:szCs w:val="18"/>
-                <w:highlight w:val="yellow"/>
-              </w:rPr>
-              <w:t>Rekomendasi:</w:t>
-            </w:r>
-          </w:p>
-          <w:p>
-            <w:pPr>
-              <w:spacing w:line="276" w:lineRule="auto"/>
-              <w:jc w:val="both"/>
-              <w:rPr>
-                <w:rFonts w:ascii="Arial" w:eastAsia="Arial" w:hAnsi="Arial" w:cs="Arial"/>
-                <w:sz w:val="18"/>
-                <w:szCs w:val="18"/>
-              </w:rPr>
-            </w:pPr>
-            <w:r>
-              <w:rPr>
-                <w:rFonts w:ascii="Arial" w:eastAsia="Arial" w:hAnsi="Arial" w:cs="Arial"/>
-                <w:sz w:val="18"/>
-                <w:szCs w:val="18"/>
-                <w:highlight w:val="yellow"/>
-              </w:rPr>
-              <w:t>Bukti dukung survey Tenaga Kerja Konstruksi agar menggunakan survey harga pasar sesuai SE Direktur Jenderal Bina Konstruksi Nomor 182/SE/Dk/2025 tentang Tata Cara Penyusunan Perkiraan Biaya Pekerjaan Konstruksi Bidang Pekerjaan Umum</w:t>
-            </w:r>
+              </w:rPr>
+            </w:pPr>
           </w:p>
           <w:p>
             <w:pPr>
@@ -13256,6 +13917,210 @@
     </w:p>
     <w:p>
       <w:pPr>
+        <w:spacing w:line="276" w:lineRule="auto"/>
+        <w:ind w:right="74"/>
+        <w:jc w:val="both"/>
+        <w:rPr>
+          <w:rFonts w:ascii="Arial" w:eastAsia="Arial" w:hAnsi="Arial" w:cs="Arial"/>
+          <w:sz w:val="22"/>
+          <w:szCs w:val="22"/>
+        </w:rPr>
+      </w:pPr>
+    </w:p>
+    <w:p>
+      <w:pPr>
+        <w:spacing w:line="276" w:lineRule="auto"/>
+        <w:ind w:right="74"/>
+        <w:jc w:val="both"/>
+        <w:rPr>
+          <w:rFonts w:ascii="Arial" w:eastAsia="Arial" w:hAnsi="Arial" w:cs="Arial"/>
+          <w:sz w:val="22"/>
+          <w:szCs w:val="22"/>
+        </w:rPr>
+      </w:pPr>
+    </w:p>
+    <w:p>
+      <w:pPr>
+        <w:spacing w:line="276" w:lineRule="auto"/>
+        <w:ind w:right="74"/>
+        <w:jc w:val="both"/>
+        <w:rPr>
+          <w:rFonts w:ascii="Arial" w:eastAsia="Arial" w:hAnsi="Arial" w:cs="Arial"/>
+          <w:sz w:val="22"/>
+          <w:szCs w:val="22"/>
+        </w:rPr>
+      </w:pPr>
+    </w:p>
+    <w:p>
+      <w:pPr>
+        <w:spacing w:line="276" w:lineRule="auto"/>
+        <w:ind w:right="74"/>
+        <w:jc w:val="both"/>
+        <w:rPr>
+          <w:rFonts w:ascii="Arial" w:eastAsia="Arial" w:hAnsi="Arial" w:cs="Arial"/>
+          <w:sz w:val="22"/>
+          <w:szCs w:val="22"/>
+        </w:rPr>
+      </w:pPr>
+    </w:p>
+    <w:p>
+      <w:pPr>
+        <w:spacing w:line="276" w:lineRule="auto"/>
+        <w:ind w:right="74"/>
+        <w:jc w:val="both"/>
+        <w:rPr>
+          <w:rFonts w:ascii="Arial" w:eastAsia="Arial" w:hAnsi="Arial" w:cs="Arial"/>
+          <w:sz w:val="22"/>
+          <w:szCs w:val="22"/>
+        </w:rPr>
+      </w:pPr>
+    </w:p>
+    <w:p>
+      <w:pPr>
+        <w:spacing w:line="276" w:lineRule="auto"/>
+        <w:ind w:right="74"/>
+        <w:jc w:val="both"/>
+        <w:rPr>
+          <w:rFonts w:ascii="Arial" w:eastAsia="Arial" w:hAnsi="Arial" w:cs="Arial"/>
+          <w:sz w:val="22"/>
+          <w:szCs w:val="22"/>
+        </w:rPr>
+      </w:pPr>
+    </w:p>
+    <w:p>
+      <w:pPr>
+        <w:spacing w:line="276" w:lineRule="auto"/>
+        <w:ind w:right="74"/>
+        <w:jc w:val="both"/>
+        <w:rPr>
+          <w:rFonts w:ascii="Arial" w:eastAsia="Arial" w:hAnsi="Arial" w:cs="Arial"/>
+          <w:sz w:val="22"/>
+          <w:szCs w:val="22"/>
+        </w:rPr>
+      </w:pPr>
+    </w:p>
+    <w:p>
+      <w:pPr>
+        <w:spacing w:line="276" w:lineRule="auto"/>
+        <w:ind w:right="74"/>
+        <w:jc w:val="both"/>
+        <w:rPr>
+          <w:rFonts w:ascii="Arial" w:eastAsia="Arial" w:hAnsi="Arial" w:cs="Arial"/>
+          <w:sz w:val="22"/>
+          <w:szCs w:val="22"/>
+        </w:rPr>
+      </w:pPr>
+    </w:p>
+    <w:p>
+      <w:pPr>
+        <w:spacing w:line="276" w:lineRule="auto"/>
+        <w:ind w:right="74"/>
+        <w:jc w:val="both"/>
+        <w:rPr>
+          <w:rFonts w:ascii="Arial" w:eastAsia="Arial" w:hAnsi="Arial" w:cs="Arial"/>
+          <w:sz w:val="22"/>
+          <w:szCs w:val="22"/>
+        </w:rPr>
+      </w:pPr>
+    </w:p>
+    <w:p>
+      <w:pPr>
+        <w:spacing w:line="276" w:lineRule="auto"/>
+        <w:ind w:right="74"/>
+        <w:jc w:val="both"/>
+        <w:rPr>
+          <w:rFonts w:ascii="Arial" w:eastAsia="Arial" w:hAnsi="Arial" w:cs="Arial"/>
+          <w:sz w:val="22"/>
+          <w:szCs w:val="22"/>
+        </w:rPr>
+      </w:pPr>
+    </w:p>
+    <w:p>
+      <w:pPr>
+        <w:spacing w:line="276" w:lineRule="auto"/>
+        <w:ind w:right="74"/>
+        <w:jc w:val="both"/>
+        <w:rPr>
+          <w:rFonts w:ascii="Arial" w:eastAsia="Arial" w:hAnsi="Arial" w:cs="Arial"/>
+          <w:sz w:val="22"/>
+          <w:szCs w:val="22"/>
+        </w:rPr>
+      </w:pPr>
+    </w:p>
+    <w:p>
+      <w:pPr>
+        <w:spacing w:line="276" w:lineRule="auto"/>
+        <w:ind w:right="74"/>
+        <w:jc w:val="both"/>
+        <w:rPr>
+          <w:rFonts w:ascii="Arial" w:eastAsia="Arial" w:hAnsi="Arial" w:cs="Arial"/>
+          <w:sz w:val="22"/>
+          <w:szCs w:val="22"/>
+        </w:rPr>
+      </w:pPr>
+    </w:p>
+    <w:p>
+      <w:pPr>
+        <w:spacing w:line="276" w:lineRule="auto"/>
+        <w:ind w:right="74"/>
+        <w:jc w:val="both"/>
+        <w:rPr>
+          <w:rFonts w:ascii="Arial" w:eastAsia="Arial" w:hAnsi="Arial" w:cs="Arial"/>
+          <w:sz w:val="22"/>
+          <w:szCs w:val="22"/>
+        </w:rPr>
+      </w:pPr>
+    </w:p>
+    <w:p>
+      <w:pPr>
+        <w:spacing w:line="276" w:lineRule="auto"/>
+        <w:ind w:right="74"/>
+        <w:jc w:val="both"/>
+        <w:rPr>
+          <w:rFonts w:ascii="Arial" w:eastAsia="Arial" w:hAnsi="Arial" w:cs="Arial"/>
+          <w:sz w:val="22"/>
+          <w:szCs w:val="22"/>
+        </w:rPr>
+      </w:pPr>
+    </w:p>
+    <w:p>
+      <w:pPr>
+        <w:spacing w:line="276" w:lineRule="auto"/>
+        <w:ind w:right="74"/>
+        <w:jc w:val="both"/>
+        <w:rPr>
+          <w:rFonts w:ascii="Arial" w:eastAsia="Arial" w:hAnsi="Arial" w:cs="Arial"/>
+          <w:sz w:val="22"/>
+          <w:szCs w:val="22"/>
+        </w:rPr>
+      </w:pPr>
+    </w:p>
+    <w:p>
+      <w:pPr>
+        <w:spacing w:line="276" w:lineRule="auto"/>
+        <w:ind w:right="74"/>
+        <w:jc w:val="both"/>
+        <w:rPr>
+          <w:rFonts w:ascii="Arial" w:eastAsia="Arial" w:hAnsi="Arial" w:cs="Arial"/>
+          <w:sz w:val="22"/>
+          <w:szCs w:val="22"/>
+        </w:rPr>
+      </w:pPr>
+    </w:p>
+    <w:p>
+      <w:pPr>
+        <w:spacing w:line="276" w:lineRule="auto"/>
+        <w:ind w:right="74"/>
+        <w:jc w:val="both"/>
+        <w:rPr>
+          <w:rFonts w:ascii="Arial" w:eastAsia="Arial" w:hAnsi="Arial" w:cs="Arial"/>
+          <w:sz w:val="22"/>
+          <w:szCs w:val="22"/>
+        </w:rPr>
+      </w:pPr>
+    </w:p>
+    <w:p>
+      <w:pPr>
         <w:jc w:val="right"/>
         <w:rPr>
           <w:rFonts w:ascii="Arial" w:eastAsia="Arial" w:hAnsi="Arial" w:cs="Arial"/>
@@ -13423,7 +14288,7 @@
           <w:szCs w:val="22"/>
         </w:rPr>
         <w:sectPr>
-          <w:headerReference w:type="first" r:id="rId17"/>
+          <w:headerReference w:type="first" r:id="rId14"/>
           <w:type w:val="evenPage"/>
           <w:pgSz w:w="16840" w:h="11920" w:orient="landscape"/>
           <w:pgMar w:top="1134" w:right="1134" w:bottom="1418" w:left="1418" w:header="720" w:footer="369" w:gutter="0"/>
@@ -13510,7 +14375,27 @@
           <w:bCs/>
           <w:lang w:val="en-US"/>
         </w:rPr>
-        <w:t>{kode_pokja}</w:t>
+        <w:t>{</w:t>
+      </w:r>
+      <w:proofErr w:type="spellStart"/>
+      <w:r>
+        <w:rPr>
+          <w:rFonts w:ascii="Arial" w:eastAsia="Arial" w:hAnsi="Arial" w:cs="Arial"/>
+          <w:b/>
+          <w:bCs/>
+          <w:lang w:val="en-US"/>
+        </w:rPr>
+        <w:t>kode_pokja</w:t>
+      </w:r>
+      <w:proofErr w:type="spellEnd"/>
+      <w:r>
+        <w:rPr>
+          <w:rFonts w:ascii="Arial" w:eastAsia="Arial" w:hAnsi="Arial" w:cs="Arial"/>
+          <w:b/>
+          <w:bCs/>
+          <w:lang w:val="en-US"/>
+        </w:rPr>
+        <w:t>}</w:t>
       </w:r>
       <w:r>
         <w:rPr>
@@ -13556,7 +14441,27 @@
           <w:bCs/>
           <w:lang w:val="en-US"/>
         </w:rPr>
-        <w:t>{tahun_anggaran}</w:t>
+        <w:t>{</w:t>
+      </w:r>
+      <w:proofErr w:type="spellStart"/>
+      <w:r>
+        <w:rPr>
+          <w:rFonts w:ascii="Arial" w:eastAsia="Arial" w:hAnsi="Arial" w:cs="Arial"/>
+          <w:b/>
+          <w:bCs/>
+          <w:lang w:val="en-US"/>
+        </w:rPr>
+        <w:t>tahun_anggaran</w:t>
+      </w:r>
+      <w:proofErr w:type="spellEnd"/>
+      <w:r>
+        <w:rPr>
+          <w:rFonts w:ascii="Arial" w:eastAsia="Arial" w:hAnsi="Arial" w:cs="Arial"/>
+          <w:b/>
+          <w:bCs/>
+          <w:lang w:val="en-US"/>
+        </w:rPr>
+        <w:t>}</w:t>
       </w:r>
     </w:p>
     <w:p>
@@ -14807,7 +15712,27 @@
           <w:bCs/>
           <w:lang w:val="en-US"/>
         </w:rPr>
-        <w:t>{satuan_kerja_upper}</w:t>
+        <w:t>{</w:t>
+      </w:r>
+      <w:proofErr w:type="spellStart"/>
+      <w:r>
+        <w:rPr>
+          <w:rFonts w:ascii="Arial" w:eastAsia="Arial" w:hAnsi="Arial" w:cs="Arial"/>
+          <w:b/>
+          <w:bCs/>
+          <w:lang w:val="en-US"/>
+        </w:rPr>
+        <w:t>satuan_kerja_upper</w:t>
+      </w:r>
+      <w:proofErr w:type="spellEnd"/>
+      <w:r>
+        <w:rPr>
+          <w:rFonts w:ascii="Arial" w:eastAsia="Arial" w:hAnsi="Arial" w:cs="Arial"/>
+          <w:b/>
+          <w:bCs/>
+          <w:lang w:val="en-US"/>
+        </w:rPr>
+        <w:t>}</w:t>
       </w:r>
     </w:p>
     <w:p>
@@ -15006,7 +15931,29 @@
                 <w:szCs w:val="22"/>
                 <w:lang w:val="en-US"/>
               </w:rPr>
-              <w:t>{nama_ppk}</w:t>
+              <w:t>{</w:t>
+            </w:r>
+            <w:proofErr w:type="spellStart"/>
+            <w:r>
+              <w:rPr>
+                <w:rFonts w:ascii="Arial" w:eastAsia="Arial" w:hAnsi="Arial" w:cs="Arial"/>
+                <w:spacing w:val="-2"/>
+                <w:sz w:val="22"/>
+                <w:szCs w:val="22"/>
+                <w:lang w:val="en-US"/>
+              </w:rPr>
+              <w:t>nama_ppk</w:t>
+            </w:r>
+            <w:proofErr w:type="spellEnd"/>
+            <w:r>
+              <w:rPr>
+                <w:rFonts w:ascii="Arial" w:eastAsia="Arial" w:hAnsi="Arial" w:cs="Arial"/>
+                <w:spacing w:val="-2"/>
+                <w:sz w:val="22"/>
+                <w:szCs w:val="22"/>
+                <w:lang w:val="en-US"/>
+              </w:rPr>
+              <w:t>}</w:t>
             </w:r>
           </w:p>
         </w:tc>
@@ -15035,7 +15982,27 @@
                 <w:szCs w:val="22"/>
                 <w:lang w:val="en-US"/>
               </w:rPr>
-              <w:t>{ppk}</w:t>
+              <w:t>{</w:t>
+            </w:r>
+            <w:proofErr w:type="spellStart"/>
+            <w:r>
+              <w:rPr>
+                <w:rFonts w:ascii="Arial" w:hAnsi="Arial" w:cs="Arial"/>
+                <w:sz w:val="22"/>
+                <w:szCs w:val="22"/>
+                <w:lang w:val="en-US"/>
+              </w:rPr>
+              <w:t>ppk</w:t>
+            </w:r>
+            <w:proofErr w:type="spellEnd"/>
+            <w:r>
+              <w:rPr>
+                <w:rFonts w:ascii="Arial" w:hAnsi="Arial" w:cs="Arial"/>
+                <w:sz w:val="22"/>
+                <w:szCs w:val="22"/>
+                <w:lang w:val="en-US"/>
+              </w:rPr>
+              <w:t>}</w:t>
             </w:r>
           </w:p>
         </w:tc>
@@ -15071,7 +16038,8 @@
       </w:pPr>
     </w:p>
     <w:sectPr>
-      <w:headerReference w:type="first" r:id="rId18"/>
+      <w:footerReference w:type="default" r:id="rId15"/>
+      <w:headerReference w:type="first" r:id="rId16"/>
       <w:pgSz w:w="11920" w:h="16840"/>
       <w:pgMar w:top="1138" w:right="1138" w:bottom="1138" w:left="1411" w:header="720" w:footer="374" w:gutter="0"/>
       <w:pgNumType w:fmt="numberInDash" w:start="2"/>
@@ -15083,7 +16051,7 @@
 </file>
 
 <file path=word/endnotes.xml><?xml version="1.0" encoding="utf-8"?>
-<w:endnotes xmlns:wpc="http://schemas.microsoft.com/office/word/2010/wordprocessingCanvas" xmlns:cx="http://schemas.microsoft.com/office/drawing/2014/chartex" xmlns:cx1="http://schemas.microsoft.com/office/drawing/2015/9/8/chartex" xmlns:cx2="http://schemas.microsoft.com/office/drawing/2015/10/21/chartex" xmlns:cx3="http://schemas.microsoft.com/office/drawing/2016/5/9/chartex" xmlns:cx4="http://schemas.microsoft.com/office/drawing/2016/5/10/chartex" xmlns:cx5="http://schemas.microsoft.com/office/drawing/2016/5/11/chartex" xmlns:cx6="http://schemas.microsoft.com/office/drawing/2016/5/12/chartex" xmlns:cx7="http://schemas.microsoft.com/office/drawing/2016/5/13/chartex" xmlns:cx8="http://schemas.microsoft.com/office/drawing/2016/5/14/chartex" xmlns:mc="http://schemas.openxmlformats.org/markup-compatibility/2006" xmlns:aink="http://schemas.microsoft.com/office/drawing/2016/ink" xmlns:am3d="http://schemas.microsoft.com/office/drawing/2017/model3d" xmlns:o="urn:schemas-microsoft-com:office:office" xmlns:oel="http://schemas.microsoft.com/office/2019/extlst" xmlns:r="http://schemas.openxmlformats.org/officeDocument/2006/relationships" xmlns:m="http://schemas.openxmlformats.org/officeDocument/2006/math" xmlns:v="urn:schemas-microsoft-com:vml" xmlns:wp14="http://schemas.microsoft.com/office/word/2010/wordprocessingDrawing" xmlns:wp="http://schemas.openxmlformats.org/drawingml/2006/wordprocessingDrawing" xmlns:w10="urn:schemas-microsoft-com:office:word" xmlns:w="http://schemas.openxmlformats.org/wordprocessingml/2006/main" xmlns:w14="http://schemas.microsoft.com/office/word/2010/wordml" xmlns:w15="http://schemas.microsoft.com/office/word/2012/wordml" xmlns:w16cex="http://schemas.microsoft.com/office/word/2018/wordml/cex" xmlns:w16cid="http://schemas.microsoft.com/office/word/2016/wordml/cid" xmlns:w16="http://schemas.microsoft.com/office/word/2018/wordml" xmlns:w16du="http://schemas.microsoft.com/office/word/2023/wordml/word16du" xmlns:w16sdtdh="http://schemas.microsoft.com/office/word/2020/wordml/sdtdatahash" xmlns:w16sdtfl="http://schemas.microsoft.com/office/word/2024/wordml/sdtformatlock" xmlns:w16se="http://schemas.microsoft.com/office/word/2015/wordml/symex" xmlns:wpg="http://schemas.microsoft.com/office/word/2010/wordprocessingGroup" xmlns:wpi="http://schemas.microsoft.com/office/word/2010/wordprocessingInk" xmlns:wne="http://schemas.microsoft.com/office/word/2006/wordml" xmlns:wps="http://schemas.microsoft.com/office/word/2010/wordprocessingShape" mc:Ignorable="w14 w15 w16se w16cid w16 w16cex w16sdtdh w16sdtfl w16du wp14">
+<w:endnotes xmlns:wpc="http://schemas.microsoft.com/office/word/2010/wordprocessingCanvas" xmlns:cx="http://schemas.microsoft.com/office/drawing/2014/chartex" xmlns:cx1="http://schemas.microsoft.com/office/drawing/2015/9/8/chartex" xmlns:cx2="http://schemas.microsoft.com/office/drawing/2015/10/21/chartex" xmlns:cx3="http://schemas.microsoft.com/office/drawing/2016/5/9/chartex" xmlns:cx4="http://schemas.microsoft.com/office/drawing/2016/5/10/chartex" xmlns:cx5="http://schemas.microsoft.com/office/drawing/2016/5/11/chartex" xmlns:cx6="http://schemas.microsoft.com/office/drawing/2016/5/12/chartex" xmlns:cx7="http://schemas.microsoft.com/office/drawing/2016/5/13/chartex" xmlns:cx8="http://schemas.microsoft.com/office/drawing/2016/5/14/chartex" xmlns:mc="http://schemas.openxmlformats.org/markup-compatibility/2006" xmlns:aink="http://schemas.microsoft.com/office/drawing/2016/ink" xmlns:am3d="http://schemas.microsoft.com/office/drawing/2017/model3d" xmlns:o="urn:schemas-microsoft-com:office:office" xmlns:r="http://schemas.openxmlformats.org/officeDocument/2006/relationships" xmlns:m="http://schemas.openxmlformats.org/officeDocument/2006/math" xmlns:v="urn:schemas-microsoft-com:vml" xmlns:wp14="http://schemas.microsoft.com/office/word/2010/wordprocessingDrawing" xmlns:wp="http://schemas.openxmlformats.org/drawingml/2006/wordprocessingDrawing" xmlns:w10="urn:schemas-microsoft-com:office:word" xmlns:w="http://schemas.openxmlformats.org/wordprocessingml/2006/main" xmlns:w14="http://schemas.microsoft.com/office/word/2010/wordml" xmlns:w15="http://schemas.microsoft.com/office/word/2012/wordml" xmlns:w16cex="http://schemas.microsoft.com/office/word/2018/wordml/cex" xmlns:w16cid="http://schemas.microsoft.com/office/word/2016/wordml/cid" xmlns:w16="http://schemas.microsoft.com/office/word/2018/wordml" xmlns:w16sdtdh="http://schemas.microsoft.com/office/word/2020/wordml/sdtdatahash" xmlns:w16se="http://schemas.microsoft.com/office/word/2015/wordml/symex" xmlns:wpg="http://schemas.microsoft.com/office/word/2010/wordprocessingGroup" xmlns:wpi="http://schemas.microsoft.com/office/word/2010/wordprocessingInk" xmlns:wne="http://schemas.microsoft.com/office/word/2006/wordml" xmlns:wps="http://schemas.microsoft.com/office/word/2010/wordprocessingShape" mc:Ignorable="w14 w15 w16se w16cid w16 w16cex w16sdtdh wp14">
   <w:endnote w:type="separator" w:id="-1">
     <w:p>
       <w:r>
@@ -15105,17 +16073,29 @@
 </file>
 
 <file path=word/footer1.xml><?xml version="1.0" encoding="utf-8"?>
-<w:ftr xmlns:wpc="http://schemas.microsoft.com/office/word/2010/wordprocessingCanvas" xmlns:cx="http://schemas.microsoft.com/office/drawing/2014/chartex" xmlns:cx1="http://schemas.microsoft.com/office/drawing/2015/9/8/chartex" xmlns:cx2="http://schemas.microsoft.com/office/drawing/2015/10/21/chartex" xmlns:cx3="http://schemas.microsoft.com/office/drawing/2016/5/9/chartex" xmlns:cx4="http://schemas.microsoft.com/office/drawing/2016/5/10/chartex" xmlns:cx5="http://schemas.microsoft.com/office/drawing/2016/5/11/chartex" xmlns:cx6="http://schemas.microsoft.com/office/drawing/2016/5/12/chartex" xmlns:cx7="http://schemas.microsoft.com/office/drawing/2016/5/13/chartex" xmlns:cx8="http://schemas.microsoft.com/office/drawing/2016/5/14/chartex" xmlns:mc="http://schemas.openxmlformats.org/markup-compatibility/2006" xmlns:aink="http://schemas.microsoft.com/office/drawing/2016/ink" xmlns:am3d="http://schemas.microsoft.com/office/drawing/2017/model3d" xmlns:o="urn:schemas-microsoft-com:office:office" xmlns:oel="http://schemas.microsoft.com/office/2019/extlst" xmlns:r="http://schemas.openxmlformats.org/officeDocument/2006/relationships" xmlns:m="http://schemas.openxmlformats.org/officeDocument/2006/math" xmlns:v="urn:schemas-microsoft-com:vml" xmlns:wp14="http://schemas.microsoft.com/office/word/2010/wordprocessingDrawing" xmlns:wp="http://schemas.openxmlformats.org/drawingml/2006/wordprocessingDrawing" xmlns:w10="urn:schemas-microsoft-com:office:word" xmlns:w="http://schemas.openxmlformats.org/wordprocessingml/2006/main" xmlns:w14="http://schemas.microsoft.com/office/word/2010/wordml" xmlns:w15="http://schemas.microsoft.com/office/word/2012/wordml" xmlns:w16cex="http://schemas.microsoft.com/office/word/2018/wordml/cex" xmlns:w16cid="http://schemas.microsoft.com/office/word/2016/wordml/cid" xmlns:w16="http://schemas.microsoft.com/office/word/2018/wordml" xmlns:w16du="http://schemas.microsoft.com/office/word/2023/wordml/word16du" xmlns:w16sdtdh="http://schemas.microsoft.com/office/word/2020/wordml/sdtdatahash" xmlns:w16sdtfl="http://schemas.microsoft.com/office/word/2024/wordml/sdtformatlock" xmlns:w16se="http://schemas.microsoft.com/office/word/2015/wordml/symex" xmlns:wpg="http://schemas.microsoft.com/office/word/2010/wordprocessingGroup" xmlns:wpi="http://schemas.microsoft.com/office/word/2010/wordprocessingInk" xmlns:wne="http://schemas.microsoft.com/office/word/2006/wordml" xmlns:wps="http://schemas.microsoft.com/office/word/2010/wordprocessingShape" mc:Ignorable="w14 w15 w16se w16cid w16 w16cex w16sdtdh w16sdtfl w16du wp14">
+<w:ftr xmlns:wpc="http://schemas.microsoft.com/office/word/2010/wordprocessingCanvas" xmlns:cx="http://schemas.microsoft.com/office/drawing/2014/chartex" xmlns:cx1="http://schemas.microsoft.com/office/drawing/2015/9/8/chartex" xmlns:cx2="http://schemas.microsoft.com/office/drawing/2015/10/21/chartex" xmlns:cx3="http://schemas.microsoft.com/office/drawing/2016/5/9/chartex" xmlns:cx4="http://schemas.microsoft.com/office/drawing/2016/5/10/chartex" xmlns:cx5="http://schemas.microsoft.com/office/drawing/2016/5/11/chartex" xmlns:cx6="http://schemas.microsoft.com/office/drawing/2016/5/12/chartex" xmlns:cx7="http://schemas.microsoft.com/office/drawing/2016/5/13/chartex" xmlns:cx8="http://schemas.microsoft.com/office/drawing/2016/5/14/chartex" xmlns:mc="http://schemas.openxmlformats.org/markup-compatibility/2006" xmlns:aink="http://schemas.microsoft.com/office/drawing/2016/ink" xmlns:am3d="http://schemas.microsoft.com/office/drawing/2017/model3d" xmlns:o="urn:schemas-microsoft-com:office:office" xmlns:r="http://schemas.openxmlformats.org/officeDocument/2006/relationships" xmlns:m="http://schemas.openxmlformats.org/officeDocument/2006/math" xmlns:v="urn:schemas-microsoft-com:vml" xmlns:wp14="http://schemas.microsoft.com/office/word/2010/wordprocessingDrawing" xmlns:wp="http://schemas.openxmlformats.org/drawingml/2006/wordprocessingDrawing" xmlns:w10="urn:schemas-microsoft-com:office:word" xmlns:w="http://schemas.openxmlformats.org/wordprocessingml/2006/main" xmlns:w14="http://schemas.microsoft.com/office/word/2010/wordml" xmlns:w15="http://schemas.microsoft.com/office/word/2012/wordml" xmlns:w16cex="http://schemas.microsoft.com/office/word/2018/wordml/cex" xmlns:w16cid="http://schemas.microsoft.com/office/word/2016/wordml/cid" xmlns:w16="http://schemas.microsoft.com/office/word/2018/wordml" xmlns:w16sdtdh="http://schemas.microsoft.com/office/word/2020/wordml/sdtdatahash" xmlns:w16se="http://schemas.microsoft.com/office/word/2015/wordml/symex" xmlns:wpg="http://schemas.microsoft.com/office/word/2010/wordprocessingGroup" xmlns:wpi="http://schemas.microsoft.com/office/word/2010/wordprocessingInk" xmlns:wne="http://schemas.microsoft.com/office/word/2006/wordml" xmlns:wps="http://schemas.microsoft.com/office/word/2010/wordprocessingShape" mc:Ignorable="w14 w15 w16se w16cid w16 w16cex w16sdtdh wp14">
   <w:p>
     <w:pPr>
       <w:pStyle w:val="Footer"/>
+      <w:jc w:val="center"/>
     </w:pPr>
   </w:p>
 </w:ftr>
 </file>
 
 <file path=word/footer2.xml><?xml version="1.0" encoding="utf-8"?>
-<w:ftr xmlns:wpc="http://schemas.microsoft.com/office/word/2010/wordprocessingCanvas" xmlns:cx="http://schemas.microsoft.com/office/drawing/2014/chartex" xmlns:cx1="http://schemas.microsoft.com/office/drawing/2015/9/8/chartex" xmlns:cx2="http://schemas.microsoft.com/office/drawing/2015/10/21/chartex" xmlns:cx3="http://schemas.microsoft.com/office/drawing/2016/5/9/chartex" xmlns:cx4="http://schemas.microsoft.com/office/drawing/2016/5/10/chartex" xmlns:cx5="http://schemas.microsoft.com/office/drawing/2016/5/11/chartex" xmlns:cx6="http://schemas.microsoft.com/office/drawing/2016/5/12/chartex" xmlns:cx7="http://schemas.microsoft.com/office/drawing/2016/5/13/chartex" xmlns:cx8="http://schemas.microsoft.com/office/drawing/2016/5/14/chartex" xmlns:mc="http://schemas.openxmlformats.org/markup-compatibility/2006" xmlns:aink="http://schemas.microsoft.com/office/drawing/2016/ink" xmlns:am3d="http://schemas.microsoft.com/office/drawing/2017/model3d" xmlns:o="urn:schemas-microsoft-com:office:office" xmlns:oel="http://schemas.microsoft.com/office/2019/extlst" xmlns:r="http://schemas.openxmlformats.org/officeDocument/2006/relationships" xmlns:m="http://schemas.openxmlformats.org/officeDocument/2006/math" xmlns:v="urn:schemas-microsoft-com:vml" xmlns:wp14="http://schemas.microsoft.com/office/word/2010/wordprocessingDrawing" xmlns:wp="http://schemas.openxmlformats.org/drawingml/2006/wordprocessingDrawing" xmlns:w10="urn:schemas-microsoft-com:office:word" xmlns:w="http://schemas.openxmlformats.org/wordprocessingml/2006/main" xmlns:w14="http://schemas.microsoft.com/office/word/2010/wordml" xmlns:w15="http://schemas.microsoft.com/office/word/2012/wordml" xmlns:w16cex="http://schemas.microsoft.com/office/word/2018/wordml/cex" xmlns:w16cid="http://schemas.microsoft.com/office/word/2016/wordml/cid" xmlns:w16="http://schemas.microsoft.com/office/word/2018/wordml" xmlns:w16du="http://schemas.microsoft.com/office/word/2023/wordml/word16du" xmlns:w16sdtdh="http://schemas.microsoft.com/office/word/2020/wordml/sdtdatahash" xmlns:w16sdtfl="http://schemas.microsoft.com/office/word/2024/wordml/sdtformatlock" xmlns:w16se="http://schemas.microsoft.com/office/word/2015/wordml/symex" xmlns:wpg="http://schemas.microsoft.com/office/word/2010/wordprocessingGroup" xmlns:wpi="http://schemas.microsoft.com/office/word/2010/wordprocessingInk" xmlns:wne="http://schemas.microsoft.com/office/word/2006/wordml" xmlns:wps="http://schemas.microsoft.com/office/word/2010/wordprocessingShape" mc:Ignorable="w14 w15 w16se w16cid w16 w16cex w16sdtdh w16sdtfl w16du wp14">
+<w:ftr xmlns:wpc="http://schemas.microsoft.com/office/word/2010/wordprocessingCanvas" xmlns:cx="http://schemas.microsoft.com/office/drawing/2014/chartex" xmlns:cx1="http://schemas.microsoft.com/office/drawing/2015/9/8/chartex" xmlns:cx2="http://schemas.microsoft.com/office/drawing/2015/10/21/chartex" xmlns:cx3="http://schemas.microsoft.com/office/drawing/2016/5/9/chartex" xmlns:cx4="http://schemas.microsoft.com/office/drawing/2016/5/10/chartex" xmlns:cx5="http://schemas.microsoft.com/office/drawing/2016/5/11/chartex" xmlns:cx6="http://schemas.microsoft.com/office/drawing/2016/5/12/chartex" xmlns:cx7="http://schemas.microsoft.com/office/drawing/2016/5/13/chartex" xmlns:cx8="http://schemas.microsoft.com/office/drawing/2016/5/14/chartex" xmlns:mc="http://schemas.openxmlformats.org/markup-compatibility/2006" xmlns:aink="http://schemas.microsoft.com/office/drawing/2016/ink" xmlns:am3d="http://schemas.microsoft.com/office/drawing/2017/model3d" xmlns:o="urn:schemas-microsoft-com:office:office" xmlns:r="http://schemas.openxmlformats.org/officeDocument/2006/relationships" xmlns:m="http://schemas.openxmlformats.org/officeDocument/2006/math" xmlns:v="urn:schemas-microsoft-com:vml" xmlns:wp14="http://schemas.microsoft.com/office/word/2010/wordprocessingDrawing" xmlns:wp="http://schemas.openxmlformats.org/drawingml/2006/wordprocessingDrawing" xmlns:w10="urn:schemas-microsoft-com:office:word" xmlns:w="http://schemas.openxmlformats.org/wordprocessingml/2006/main" xmlns:w14="http://schemas.microsoft.com/office/word/2010/wordml" xmlns:w15="http://schemas.microsoft.com/office/word/2012/wordml" xmlns:w16cex="http://schemas.microsoft.com/office/word/2018/wordml/cex" xmlns:w16cid="http://schemas.microsoft.com/office/word/2016/wordml/cid" xmlns:w16="http://schemas.microsoft.com/office/word/2018/wordml" xmlns:w16sdtdh="http://schemas.microsoft.com/office/word/2020/wordml/sdtdatahash" xmlns:w16se="http://schemas.microsoft.com/office/word/2015/wordml/symex" xmlns:wpg="http://schemas.microsoft.com/office/word/2010/wordprocessingGroup" xmlns:wpi="http://schemas.microsoft.com/office/word/2010/wordprocessingInk" xmlns:wne="http://schemas.microsoft.com/office/word/2006/wordml" xmlns:wps="http://schemas.microsoft.com/office/word/2010/wordprocessingShape" mc:Ignorable="w14 w15 w16se w16cid w16 w16cex w16sdtdh wp14">
+  <w:p>
+    <w:pPr>
+      <w:pStyle w:val="Footer"/>
+      <w:jc w:val="center"/>
+    </w:pPr>
+  </w:p>
+</w:ftr>
+</file>
+
+<file path=word/footer3.xml><?xml version="1.0" encoding="utf-8"?>
+<w:ftr xmlns:wpc="http://schemas.microsoft.com/office/word/2010/wordprocessingCanvas" xmlns:cx="http://schemas.microsoft.com/office/drawing/2014/chartex" xmlns:cx1="http://schemas.microsoft.com/office/drawing/2015/9/8/chartex" xmlns:cx2="http://schemas.microsoft.com/office/drawing/2015/10/21/chartex" xmlns:cx3="http://schemas.microsoft.com/office/drawing/2016/5/9/chartex" xmlns:cx4="http://schemas.microsoft.com/office/drawing/2016/5/10/chartex" xmlns:cx5="http://schemas.microsoft.com/office/drawing/2016/5/11/chartex" xmlns:cx6="http://schemas.microsoft.com/office/drawing/2016/5/12/chartex" xmlns:cx7="http://schemas.microsoft.com/office/drawing/2016/5/13/chartex" xmlns:cx8="http://schemas.microsoft.com/office/drawing/2016/5/14/chartex" xmlns:mc="http://schemas.openxmlformats.org/markup-compatibility/2006" xmlns:aink="http://schemas.microsoft.com/office/drawing/2016/ink" xmlns:am3d="http://schemas.microsoft.com/office/drawing/2017/model3d" xmlns:o="urn:schemas-microsoft-com:office:office" xmlns:r="http://schemas.openxmlformats.org/officeDocument/2006/relationships" xmlns:m="http://schemas.openxmlformats.org/officeDocument/2006/math" xmlns:v="urn:schemas-microsoft-com:vml" xmlns:wp14="http://schemas.microsoft.com/office/word/2010/wordprocessingDrawing" xmlns:wp="http://schemas.openxmlformats.org/drawingml/2006/wordprocessingDrawing" xmlns:w10="urn:schemas-microsoft-com:office:word" xmlns:w="http://schemas.openxmlformats.org/wordprocessingml/2006/main" xmlns:w14="http://schemas.microsoft.com/office/word/2010/wordml" xmlns:w15="http://schemas.microsoft.com/office/word/2012/wordml" xmlns:w16cex="http://schemas.microsoft.com/office/word/2018/wordml/cex" xmlns:w16cid="http://schemas.microsoft.com/office/word/2016/wordml/cid" xmlns:w16="http://schemas.microsoft.com/office/word/2018/wordml" xmlns:w16sdtdh="http://schemas.microsoft.com/office/word/2020/wordml/sdtdatahash" xmlns:w16se="http://schemas.microsoft.com/office/word/2015/wordml/symex" xmlns:wpg="http://schemas.microsoft.com/office/word/2010/wordprocessingGroup" xmlns:wpi="http://schemas.microsoft.com/office/word/2010/wordprocessingInk" xmlns:wne="http://schemas.microsoft.com/office/word/2006/wordml" xmlns:wps="http://schemas.microsoft.com/office/word/2010/wordprocessingShape" mc:Ignorable="w14 w15 w16se w16cid w16 w16cex w16sdtdh wp14">
   <w:p>
     <w:pPr>
       <w:pStyle w:val="Footer"/>
@@ -15126,64 +16106,7 @@
         <w:noProof/>
       </w:rPr>
       <w:drawing>
-        <wp:inline distT="0" distB="0" distL="0" distR="0" wp14:anchorId="5F5B3743" wp14:editId="4963FC07">
-          <wp:extent cx="1076325" cy="783054"/>
-          <wp:effectExtent l="0" t="0" r="0" b="0"/>
-          <wp:docPr id="1679832176" name="Picture 2" descr="A black and blue rectangular card with red text&#10;&#10;Description automatically generated"/>
-          <wp:cNvGraphicFramePr>
-            <a:graphicFrameLocks xmlns:a="http://schemas.openxmlformats.org/drawingml/2006/main" noChangeAspect="1"/>
-          </wp:cNvGraphicFramePr>
-          <a:graphic xmlns:a="http://schemas.openxmlformats.org/drawingml/2006/main">
-            <a:graphicData uri="http://schemas.openxmlformats.org/drawingml/2006/picture">
-              <pic:pic xmlns:pic="http://schemas.openxmlformats.org/drawingml/2006/picture">
-                <pic:nvPicPr>
-                  <pic:cNvPr id="1524224242" name="Picture 2" descr="A black and blue rectangular card with red text&#10;&#10;Description automatically generated"/>
-                  <pic:cNvPicPr/>
-                </pic:nvPicPr>
-                <pic:blipFill>
-                  <a:blip r:embed="rId1">
-                    <a:extLst>
-                      <a:ext uri="{28A0092B-C50C-407E-A947-70E740481C1C}">
-                        <a14:useLocalDpi xmlns:a14="http://schemas.microsoft.com/office/drawing/2010/main" val="0"/>
-                      </a:ext>
-                    </a:extLst>
-                  </a:blip>
-                  <a:stretch>
-                    <a:fillRect/>
-                  </a:stretch>
-                </pic:blipFill>
-                <pic:spPr>
-                  <a:xfrm>
-                    <a:off x="0" y="0"/>
-                    <a:ext cx="1139584" cy="829077"/>
-                  </a:xfrm>
-                  <a:prstGeom prst="rect">
-                    <a:avLst/>
-                  </a:prstGeom>
-                </pic:spPr>
-              </pic:pic>
-            </a:graphicData>
-          </a:graphic>
-        </wp:inline>
-      </w:drawing>
-    </w:r>
-  </w:p>
-</w:ftr>
-</file>
-
-<file path=word/footer3.xml><?xml version="1.0" encoding="utf-8"?>
-<w:ftr xmlns:wpc="http://schemas.microsoft.com/office/word/2010/wordprocessingCanvas" xmlns:cx="http://schemas.microsoft.com/office/drawing/2014/chartex" xmlns:cx1="http://schemas.microsoft.com/office/drawing/2015/9/8/chartex" xmlns:cx2="http://schemas.microsoft.com/office/drawing/2015/10/21/chartex" xmlns:cx3="http://schemas.microsoft.com/office/drawing/2016/5/9/chartex" xmlns:cx4="http://schemas.microsoft.com/office/drawing/2016/5/10/chartex" xmlns:cx5="http://schemas.microsoft.com/office/drawing/2016/5/11/chartex" xmlns:cx6="http://schemas.microsoft.com/office/drawing/2016/5/12/chartex" xmlns:cx7="http://schemas.microsoft.com/office/drawing/2016/5/13/chartex" xmlns:cx8="http://schemas.microsoft.com/office/drawing/2016/5/14/chartex" xmlns:mc="http://schemas.openxmlformats.org/markup-compatibility/2006" xmlns:aink="http://schemas.microsoft.com/office/drawing/2016/ink" xmlns:am3d="http://schemas.microsoft.com/office/drawing/2017/model3d" xmlns:o="urn:schemas-microsoft-com:office:office" xmlns:oel="http://schemas.microsoft.com/office/2019/extlst" xmlns:r="http://schemas.openxmlformats.org/officeDocument/2006/relationships" xmlns:m="http://schemas.openxmlformats.org/officeDocument/2006/math" xmlns:v="urn:schemas-microsoft-com:vml" xmlns:wp14="http://schemas.microsoft.com/office/word/2010/wordprocessingDrawing" xmlns:wp="http://schemas.openxmlformats.org/drawingml/2006/wordprocessingDrawing" xmlns:w10="urn:schemas-microsoft-com:office:word" xmlns:w="http://schemas.openxmlformats.org/wordprocessingml/2006/main" xmlns:w14="http://schemas.microsoft.com/office/word/2010/wordml" xmlns:w15="http://schemas.microsoft.com/office/word/2012/wordml" xmlns:w16cex="http://schemas.microsoft.com/office/word/2018/wordml/cex" xmlns:w16cid="http://schemas.microsoft.com/office/word/2016/wordml/cid" xmlns:w16="http://schemas.microsoft.com/office/word/2018/wordml" xmlns:w16du="http://schemas.microsoft.com/office/word/2023/wordml/word16du" xmlns:w16sdtdh="http://schemas.microsoft.com/office/word/2020/wordml/sdtdatahash" xmlns:w16sdtfl="http://schemas.microsoft.com/office/word/2024/wordml/sdtformatlock" xmlns:w16se="http://schemas.microsoft.com/office/word/2015/wordml/symex" xmlns:wpg="http://schemas.microsoft.com/office/word/2010/wordprocessingGroup" xmlns:wpi="http://schemas.microsoft.com/office/word/2010/wordprocessingInk" xmlns:wne="http://schemas.microsoft.com/office/word/2006/wordml" xmlns:wps="http://schemas.microsoft.com/office/word/2010/wordprocessingShape" mc:Ignorable="w14 w15 w16se w16cid w16 w16cex w16sdtdh w16sdtfl w16du wp14">
-  <w:p>
-    <w:pPr>
-      <w:pStyle w:val="Footer"/>
-      <w:jc w:val="center"/>
-    </w:pPr>
-    <w:r>
-      <w:rPr>
-        <w:noProof/>
-      </w:rPr>
-      <w:drawing>
-        <wp:inline distT="0" distB="0" distL="0" distR="0" wp14:anchorId="46867300" wp14:editId="2EF69B4C">
+        <wp:inline distT="0" distB="0" distL="0" distR="0" wp14:anchorId="080F6415" wp14:editId="517F2742">
           <wp:extent cx="1076325" cy="783054"/>
           <wp:effectExtent l="0" t="0" r="0" b="0"/>
           <wp:docPr id="901662316" name="Picture 2" descr="A black and blue rectangular card with red text&#10;&#10;Description automatically generated"/>
@@ -15229,7 +16152,7 @@
 </file>
 
 <file path=word/footnotes.xml><?xml version="1.0" encoding="utf-8"?>
-<w:footnotes xmlns:wpc="http://schemas.microsoft.com/office/word/2010/wordprocessingCanvas" xmlns:cx="http://schemas.microsoft.com/office/drawing/2014/chartex" xmlns:cx1="http://schemas.microsoft.com/office/drawing/2015/9/8/chartex" xmlns:cx2="http://schemas.microsoft.com/office/drawing/2015/10/21/chartex" xmlns:cx3="http://schemas.microsoft.com/office/drawing/2016/5/9/chartex" xmlns:cx4="http://schemas.microsoft.com/office/drawing/2016/5/10/chartex" xmlns:cx5="http://schemas.microsoft.com/office/drawing/2016/5/11/chartex" xmlns:cx6="http://schemas.microsoft.com/office/drawing/2016/5/12/chartex" xmlns:cx7="http://schemas.microsoft.com/office/drawing/2016/5/13/chartex" xmlns:cx8="http://schemas.microsoft.com/office/drawing/2016/5/14/chartex" xmlns:mc="http://schemas.openxmlformats.org/markup-compatibility/2006" xmlns:aink="http://schemas.microsoft.com/office/drawing/2016/ink" xmlns:am3d="http://schemas.microsoft.com/office/drawing/2017/model3d" xmlns:o="urn:schemas-microsoft-com:office:office" xmlns:oel="http://schemas.microsoft.com/office/2019/extlst" xmlns:r="http://schemas.openxmlformats.org/officeDocument/2006/relationships" xmlns:m="http://schemas.openxmlformats.org/officeDocument/2006/math" xmlns:v="urn:schemas-microsoft-com:vml" xmlns:wp14="http://schemas.microsoft.com/office/word/2010/wordprocessingDrawing" xmlns:wp="http://schemas.openxmlformats.org/drawingml/2006/wordprocessingDrawing" xmlns:w10="urn:schemas-microsoft-com:office:word" xmlns:w="http://schemas.openxmlformats.org/wordprocessingml/2006/main" xmlns:w14="http://schemas.microsoft.com/office/word/2010/wordml" xmlns:w15="http://schemas.microsoft.com/office/word/2012/wordml" xmlns:w16cex="http://schemas.microsoft.com/office/word/2018/wordml/cex" xmlns:w16cid="http://schemas.microsoft.com/office/word/2016/wordml/cid" xmlns:w16="http://schemas.microsoft.com/office/word/2018/wordml" xmlns:w16du="http://schemas.microsoft.com/office/word/2023/wordml/word16du" xmlns:w16sdtdh="http://schemas.microsoft.com/office/word/2020/wordml/sdtdatahash" xmlns:w16sdtfl="http://schemas.microsoft.com/office/word/2024/wordml/sdtformatlock" xmlns:w16se="http://schemas.microsoft.com/office/word/2015/wordml/symex" xmlns:wpg="http://schemas.microsoft.com/office/word/2010/wordprocessingGroup" xmlns:wpi="http://schemas.microsoft.com/office/word/2010/wordprocessingInk" xmlns:wne="http://schemas.microsoft.com/office/word/2006/wordml" xmlns:wps="http://schemas.microsoft.com/office/word/2010/wordprocessingShape" mc:Ignorable="w14 w15 w16se w16cid w16 w16cex w16sdtdh w16sdtfl w16du wp14">
+<w:footnotes xmlns:wpc="http://schemas.microsoft.com/office/word/2010/wordprocessingCanvas" xmlns:cx="http://schemas.microsoft.com/office/drawing/2014/chartex" xmlns:cx1="http://schemas.microsoft.com/office/drawing/2015/9/8/chartex" xmlns:cx2="http://schemas.microsoft.com/office/drawing/2015/10/21/chartex" xmlns:cx3="http://schemas.microsoft.com/office/drawing/2016/5/9/chartex" xmlns:cx4="http://schemas.microsoft.com/office/drawing/2016/5/10/chartex" xmlns:cx5="http://schemas.microsoft.com/office/drawing/2016/5/11/chartex" xmlns:cx6="http://schemas.microsoft.com/office/drawing/2016/5/12/chartex" xmlns:cx7="http://schemas.microsoft.com/office/drawing/2016/5/13/chartex" xmlns:cx8="http://schemas.microsoft.com/office/drawing/2016/5/14/chartex" xmlns:mc="http://schemas.openxmlformats.org/markup-compatibility/2006" xmlns:aink="http://schemas.microsoft.com/office/drawing/2016/ink" xmlns:am3d="http://schemas.microsoft.com/office/drawing/2017/model3d" xmlns:o="urn:schemas-microsoft-com:office:office" xmlns:r="http://schemas.openxmlformats.org/officeDocument/2006/relationships" xmlns:m="http://schemas.openxmlformats.org/officeDocument/2006/math" xmlns:v="urn:schemas-microsoft-com:vml" xmlns:wp14="http://schemas.microsoft.com/office/word/2010/wordprocessingDrawing" xmlns:wp="http://schemas.openxmlformats.org/drawingml/2006/wordprocessingDrawing" xmlns:w10="urn:schemas-microsoft-com:office:word" xmlns:w="http://schemas.openxmlformats.org/wordprocessingml/2006/main" xmlns:w14="http://schemas.microsoft.com/office/word/2010/wordml" xmlns:w15="http://schemas.microsoft.com/office/word/2012/wordml" xmlns:w16cex="http://schemas.microsoft.com/office/word/2018/wordml/cex" xmlns:w16cid="http://schemas.microsoft.com/office/word/2016/wordml/cid" xmlns:w16="http://schemas.microsoft.com/office/word/2018/wordml" xmlns:w16sdtdh="http://schemas.microsoft.com/office/word/2020/wordml/sdtdatahash" xmlns:w16se="http://schemas.microsoft.com/office/word/2015/wordml/symex" xmlns:wpg="http://schemas.microsoft.com/office/word/2010/wordprocessingGroup" xmlns:wpi="http://schemas.microsoft.com/office/word/2010/wordprocessingInk" xmlns:wne="http://schemas.microsoft.com/office/word/2006/wordml" xmlns:wps="http://schemas.microsoft.com/office/word/2010/wordprocessingShape" mc:Ignorable="w14 w15 w16se w16cid w16 w16cex w16sdtdh wp14">
   <w:footnote w:type="separator" w:id="-1">
     <w:p>
       <w:r>
@@ -15251,27 +16174,7 @@
 </file>
 
 <file path=word/header1.xml><?xml version="1.0" encoding="utf-8"?>
-<w:hdr xmlns:wpc="http://schemas.microsoft.com/office/word/2010/wordprocessingCanvas" xmlns:cx="http://schemas.microsoft.com/office/drawing/2014/chartex" xmlns:cx1="http://schemas.microsoft.com/office/drawing/2015/9/8/chartex" xmlns:cx2="http://schemas.microsoft.com/office/drawing/2015/10/21/chartex" xmlns:cx3="http://schemas.microsoft.com/office/drawing/2016/5/9/chartex" xmlns:cx4="http://schemas.microsoft.com/office/drawing/2016/5/10/chartex" xmlns:cx5="http://schemas.microsoft.com/office/drawing/2016/5/11/chartex" xmlns:cx6="http://schemas.microsoft.com/office/drawing/2016/5/12/chartex" xmlns:cx7="http://schemas.microsoft.com/office/drawing/2016/5/13/chartex" xmlns:cx8="http://schemas.microsoft.com/office/drawing/2016/5/14/chartex" xmlns:mc="http://schemas.openxmlformats.org/markup-compatibility/2006" xmlns:aink="http://schemas.microsoft.com/office/drawing/2016/ink" xmlns:am3d="http://schemas.microsoft.com/office/drawing/2017/model3d" xmlns:o="urn:schemas-microsoft-com:office:office" xmlns:oel="http://schemas.microsoft.com/office/2019/extlst" xmlns:r="http://schemas.openxmlformats.org/officeDocument/2006/relationships" xmlns:m="http://schemas.openxmlformats.org/officeDocument/2006/math" xmlns:v="urn:schemas-microsoft-com:vml" xmlns:wp14="http://schemas.microsoft.com/office/word/2010/wordprocessingDrawing" xmlns:wp="http://schemas.openxmlformats.org/drawingml/2006/wordprocessingDrawing" xmlns:w10="urn:schemas-microsoft-com:office:word" xmlns:w="http://schemas.openxmlformats.org/wordprocessingml/2006/main" xmlns:w14="http://schemas.microsoft.com/office/word/2010/wordml" xmlns:w15="http://schemas.microsoft.com/office/word/2012/wordml" xmlns:w16cex="http://schemas.microsoft.com/office/word/2018/wordml/cex" xmlns:w16cid="http://schemas.microsoft.com/office/word/2016/wordml/cid" xmlns:w16="http://schemas.microsoft.com/office/word/2018/wordml" xmlns:w16du="http://schemas.microsoft.com/office/word/2023/wordml/word16du" xmlns:w16sdtdh="http://schemas.microsoft.com/office/word/2020/wordml/sdtdatahash" xmlns:w16sdtfl="http://schemas.microsoft.com/office/word/2024/wordml/sdtformatlock" xmlns:w16se="http://schemas.microsoft.com/office/word/2015/wordml/symex" xmlns:wpg="http://schemas.microsoft.com/office/word/2010/wordprocessingGroup" xmlns:wpi="http://schemas.microsoft.com/office/word/2010/wordprocessingInk" xmlns:wne="http://schemas.microsoft.com/office/word/2006/wordml" xmlns:wps="http://schemas.microsoft.com/office/word/2010/wordprocessingShape" mc:Ignorable="w14 w15 w16se w16cid w16 w16cex w16sdtdh w16sdtfl w16du wp14">
-  <w:p>
-    <w:pPr>
-      <w:pStyle w:val="Header"/>
-    </w:pPr>
-  </w:p>
-</w:hdr>
-</file>
-
-<file path=word/header2.xml><?xml version="1.0" encoding="utf-8"?>
-<w:hdr xmlns:wpc="http://schemas.microsoft.com/office/word/2010/wordprocessingCanvas" xmlns:cx="http://schemas.microsoft.com/office/drawing/2014/chartex" xmlns:cx1="http://schemas.microsoft.com/office/drawing/2015/9/8/chartex" xmlns:cx2="http://schemas.microsoft.com/office/drawing/2015/10/21/chartex" xmlns:cx3="http://schemas.microsoft.com/office/drawing/2016/5/9/chartex" xmlns:cx4="http://schemas.microsoft.com/office/drawing/2016/5/10/chartex" xmlns:cx5="http://schemas.microsoft.com/office/drawing/2016/5/11/chartex" xmlns:cx6="http://schemas.microsoft.com/office/drawing/2016/5/12/chartex" xmlns:cx7="http://schemas.microsoft.com/office/drawing/2016/5/13/chartex" xmlns:cx8="http://schemas.microsoft.com/office/drawing/2016/5/14/chartex" xmlns:mc="http://schemas.openxmlformats.org/markup-compatibility/2006" xmlns:aink="http://schemas.microsoft.com/office/drawing/2016/ink" xmlns:am3d="http://schemas.microsoft.com/office/drawing/2017/model3d" xmlns:o="urn:schemas-microsoft-com:office:office" xmlns:oel="http://schemas.microsoft.com/office/2019/extlst" xmlns:r="http://schemas.openxmlformats.org/officeDocument/2006/relationships" xmlns:m="http://schemas.openxmlformats.org/officeDocument/2006/math" xmlns:v="urn:schemas-microsoft-com:vml" xmlns:wp14="http://schemas.microsoft.com/office/word/2010/wordprocessingDrawing" xmlns:wp="http://schemas.openxmlformats.org/drawingml/2006/wordprocessingDrawing" xmlns:w10="urn:schemas-microsoft-com:office:word" xmlns:w="http://schemas.openxmlformats.org/wordprocessingml/2006/main" xmlns:w14="http://schemas.microsoft.com/office/word/2010/wordml" xmlns:w15="http://schemas.microsoft.com/office/word/2012/wordml" xmlns:w16cex="http://schemas.microsoft.com/office/word/2018/wordml/cex" xmlns:w16cid="http://schemas.microsoft.com/office/word/2016/wordml/cid" xmlns:w16="http://schemas.microsoft.com/office/word/2018/wordml" xmlns:w16du="http://schemas.microsoft.com/office/word/2023/wordml/word16du" xmlns:w16sdtdh="http://schemas.microsoft.com/office/word/2020/wordml/sdtdatahash" xmlns:w16sdtfl="http://schemas.microsoft.com/office/word/2024/wordml/sdtformatlock" xmlns:w16se="http://schemas.microsoft.com/office/word/2015/wordml/symex" xmlns:wpg="http://schemas.microsoft.com/office/word/2010/wordprocessingGroup" xmlns:wpi="http://schemas.microsoft.com/office/word/2010/wordprocessingInk" xmlns:wne="http://schemas.microsoft.com/office/word/2006/wordml" xmlns:wps="http://schemas.microsoft.com/office/word/2010/wordprocessingShape" mc:Ignorable="w14 w15 w16se w16cid w16 w16cex w16sdtdh w16sdtfl w16du wp14">
-  <w:p>
-    <w:pPr>
-      <w:pStyle w:val="Header"/>
-    </w:pPr>
-  </w:p>
-</w:hdr>
-</file>
-
-<file path=word/header3.xml><?xml version="1.0" encoding="utf-8"?>
-<w:hdr xmlns:wpc="http://schemas.microsoft.com/office/word/2010/wordprocessingCanvas" xmlns:cx="http://schemas.microsoft.com/office/drawing/2014/chartex" xmlns:cx1="http://schemas.microsoft.com/office/drawing/2015/9/8/chartex" xmlns:cx2="http://schemas.microsoft.com/office/drawing/2015/10/21/chartex" xmlns:cx3="http://schemas.microsoft.com/office/drawing/2016/5/9/chartex" xmlns:cx4="http://schemas.microsoft.com/office/drawing/2016/5/10/chartex" xmlns:cx5="http://schemas.microsoft.com/office/drawing/2016/5/11/chartex" xmlns:cx6="http://schemas.microsoft.com/office/drawing/2016/5/12/chartex" xmlns:cx7="http://schemas.microsoft.com/office/drawing/2016/5/13/chartex" xmlns:cx8="http://schemas.microsoft.com/office/drawing/2016/5/14/chartex" xmlns:mc="http://schemas.openxmlformats.org/markup-compatibility/2006" xmlns:aink="http://schemas.microsoft.com/office/drawing/2016/ink" xmlns:am3d="http://schemas.microsoft.com/office/drawing/2017/model3d" xmlns:o="urn:schemas-microsoft-com:office:office" xmlns:oel="http://schemas.microsoft.com/office/2019/extlst" xmlns:r="http://schemas.openxmlformats.org/officeDocument/2006/relationships" xmlns:m="http://schemas.openxmlformats.org/officeDocument/2006/math" xmlns:v="urn:schemas-microsoft-com:vml" xmlns:wp14="http://schemas.microsoft.com/office/word/2010/wordprocessingDrawing" xmlns:wp="http://schemas.openxmlformats.org/drawingml/2006/wordprocessingDrawing" xmlns:w10="urn:schemas-microsoft-com:office:word" xmlns:w="http://schemas.openxmlformats.org/wordprocessingml/2006/main" xmlns:w14="http://schemas.microsoft.com/office/word/2010/wordml" xmlns:w15="http://schemas.microsoft.com/office/word/2012/wordml" xmlns:w16cex="http://schemas.microsoft.com/office/word/2018/wordml/cex" xmlns:w16cid="http://schemas.microsoft.com/office/word/2016/wordml/cid" xmlns:w16="http://schemas.microsoft.com/office/word/2018/wordml" xmlns:w16du="http://schemas.microsoft.com/office/word/2023/wordml/word16du" xmlns:w16sdtdh="http://schemas.microsoft.com/office/word/2020/wordml/sdtdatahash" xmlns:w16sdtfl="http://schemas.microsoft.com/office/word/2024/wordml/sdtformatlock" xmlns:w16se="http://schemas.microsoft.com/office/word/2015/wordml/symex" xmlns:wpg="http://schemas.microsoft.com/office/word/2010/wordprocessingGroup" xmlns:wpi="http://schemas.microsoft.com/office/word/2010/wordprocessingInk" xmlns:wne="http://schemas.microsoft.com/office/word/2006/wordml" xmlns:wps="http://schemas.microsoft.com/office/word/2010/wordprocessingShape" mc:Ignorable="w14 w15 w16se w16cid w16 w16cex w16sdtdh w16sdtfl w16du wp14">
+<w:hdr xmlns:wpc="http://schemas.microsoft.com/office/word/2010/wordprocessingCanvas" xmlns:cx="http://schemas.microsoft.com/office/drawing/2014/chartex" xmlns:cx1="http://schemas.microsoft.com/office/drawing/2015/9/8/chartex" xmlns:cx2="http://schemas.microsoft.com/office/drawing/2015/10/21/chartex" xmlns:cx3="http://schemas.microsoft.com/office/drawing/2016/5/9/chartex" xmlns:cx4="http://schemas.microsoft.com/office/drawing/2016/5/10/chartex" xmlns:cx5="http://schemas.microsoft.com/office/drawing/2016/5/11/chartex" xmlns:cx6="http://schemas.microsoft.com/office/drawing/2016/5/12/chartex" xmlns:cx7="http://schemas.microsoft.com/office/drawing/2016/5/13/chartex" xmlns:cx8="http://schemas.microsoft.com/office/drawing/2016/5/14/chartex" xmlns:mc="http://schemas.openxmlformats.org/markup-compatibility/2006" xmlns:aink="http://schemas.microsoft.com/office/drawing/2016/ink" xmlns:am3d="http://schemas.microsoft.com/office/drawing/2017/model3d" xmlns:o="urn:schemas-microsoft-com:office:office" xmlns:r="http://schemas.openxmlformats.org/officeDocument/2006/relationships" xmlns:m="http://schemas.openxmlformats.org/officeDocument/2006/math" xmlns:v="urn:schemas-microsoft-com:vml" xmlns:wp14="http://schemas.microsoft.com/office/word/2010/wordprocessingDrawing" xmlns:wp="http://schemas.openxmlformats.org/drawingml/2006/wordprocessingDrawing" xmlns:w10="urn:schemas-microsoft-com:office:word" xmlns:w="http://schemas.openxmlformats.org/wordprocessingml/2006/main" xmlns:w14="http://schemas.microsoft.com/office/word/2010/wordml" xmlns:w15="http://schemas.microsoft.com/office/word/2012/wordml" xmlns:w16cex="http://schemas.microsoft.com/office/word/2018/wordml/cex" xmlns:w16cid="http://schemas.microsoft.com/office/word/2016/wordml/cid" xmlns:w16="http://schemas.microsoft.com/office/word/2018/wordml" xmlns:w16sdtdh="http://schemas.microsoft.com/office/word/2020/wordml/sdtdatahash" xmlns:w16se="http://schemas.microsoft.com/office/word/2015/wordml/symex" xmlns:wpg="http://schemas.microsoft.com/office/word/2010/wordprocessingGroup" xmlns:wpi="http://schemas.microsoft.com/office/word/2010/wordprocessingInk" xmlns:wne="http://schemas.microsoft.com/office/word/2006/wordml" xmlns:wps="http://schemas.microsoft.com/office/word/2010/wordprocessingShape" mc:Ignorable="w14 w15 w16se w16cid w16 w16cex w16sdtdh wp14">
   <w:p>
     <w:pPr>
       <w:widowControl w:val="0"/>
@@ -15451,7 +16354,33 @@
         <w:szCs w:val="16"/>
         <w:lang w:val="en-US"/>
       </w:rPr>
-      <w:t xml:space="preserve">{kode_pokja} </w:t>
+      <w:t>{</w:t>
+    </w:r>
+    <w:proofErr w:type="spellStart"/>
+    <w:r>
+      <w:rPr>
+        <w:rFonts w:ascii="Arial" w:eastAsia="Calibri" w:hAnsi="Arial" w:cs="Arial"/>
+        <w:b/>
+        <w:bCs/>
+        <w:spacing w:val="-8"/>
+        <w:sz w:val="16"/>
+        <w:szCs w:val="16"/>
+        <w:lang w:val="en-US"/>
+      </w:rPr>
+      <w:t>kode_pokja</w:t>
+    </w:r>
+    <w:proofErr w:type="spellEnd"/>
+    <w:r>
+      <w:rPr>
+        <w:rFonts w:ascii="Arial" w:eastAsia="Calibri" w:hAnsi="Arial" w:cs="Arial"/>
+        <w:b/>
+        <w:bCs/>
+        <w:spacing w:val="-8"/>
+        <w:sz w:val="16"/>
+        <w:szCs w:val="16"/>
+        <w:lang w:val="en-US"/>
+      </w:rPr>
+      <w:t xml:space="preserve">} </w:t>
     </w:r>
     <w:r>
       <w:rPr>
@@ -15486,19 +16415,61 @@
       </w:rPr>
       <w:t xml:space="preserve">Jl. Yos Sudarso No. 37A Lt.2, Banjarmasin 70119 Telepon (0511) 6723416 Surel </w:t>
     </w:r>
-    <w:hyperlink r:id="rId2" w:history="1">
-      <w:r>
-        <w:rPr>
-          <w:rFonts w:ascii="Arial" w:eastAsia="Calibri" w:hAnsi="Arial" w:cs="Arial"/>
-          <w:color w:val="0000FF"/>
-          <w:sz w:val="15"/>
-          <w:szCs w:val="15"/>
-          <w:u w:val="single"/>
-          <w:lang w:val="en-US"/>
-        </w:rPr>
-        <w:t>{email_ketua_pokja}</w:t>
-      </w:r>
-    </w:hyperlink>
+    <w:r>
+      <w:fldChar w:fldCharType="begin"/>
+    </w:r>
+    <w:r>
+      <w:instrText xml:space="preserve"> HYPERLINK "mailto:%7bemail_ketua_pokja%7ddi." </w:instrText>
+    </w:r>
+    <w:r>
+      <w:fldChar w:fldCharType="separate"/>
+    </w:r>
+    <w:r>
+      <w:rPr>
+        <w:rFonts w:ascii="Arial" w:eastAsia="Calibri" w:hAnsi="Arial" w:cs="Arial"/>
+        <w:color w:val="0000FF"/>
+        <w:sz w:val="15"/>
+        <w:szCs w:val="15"/>
+        <w:u w:val="single"/>
+        <w:lang w:val="en-US"/>
+      </w:rPr>
+      <w:t>{</w:t>
+    </w:r>
+    <w:proofErr w:type="spellStart"/>
+    <w:r>
+      <w:rPr>
+        <w:rFonts w:ascii="Arial" w:eastAsia="Calibri" w:hAnsi="Arial" w:cs="Arial"/>
+        <w:color w:val="0000FF"/>
+        <w:sz w:val="15"/>
+        <w:szCs w:val="15"/>
+        <w:u w:val="single"/>
+        <w:lang w:val="en-US"/>
+      </w:rPr>
+      <w:t>email_ketua_pokja</w:t>
+    </w:r>
+    <w:proofErr w:type="spellEnd"/>
+    <w:r>
+      <w:rPr>
+        <w:rFonts w:ascii="Arial" w:eastAsia="Calibri" w:hAnsi="Arial" w:cs="Arial"/>
+        <w:color w:val="0000FF"/>
+        <w:sz w:val="15"/>
+        <w:szCs w:val="15"/>
+        <w:u w:val="single"/>
+        <w:lang w:val="en-US"/>
+      </w:rPr>
+      <w:t>}</w:t>
+    </w:r>
+    <w:r>
+      <w:rPr>
+        <w:rFonts w:ascii="Arial" w:eastAsia="Calibri" w:hAnsi="Arial" w:cs="Arial"/>
+        <w:color w:val="0000FF"/>
+        <w:sz w:val="15"/>
+        <w:szCs w:val="15"/>
+        <w:u w:val="single"/>
+        <w:lang w:val="en-US"/>
+      </w:rPr>
+      <w:fldChar w:fldCharType="end"/>
+    </w:r>
     <w:r>
       <w:rPr>
         <w:rFonts w:ascii="Arial" w:eastAsia="Calibri" w:hAnsi="Arial" w:cs="Arial"/>
@@ -15580,7 +16551,7 @@
             </wp:anchor>
           </w:drawing>
         </mc:Choice>
-        <mc:Fallback>
+        <mc:Fallback xmlns:w16sdtfl="http://schemas.microsoft.com/office/word/2024/wordml/sdtformatlock" xmlns:w16du="http://schemas.microsoft.com/office/word/2023/wordml/word16du" xmlns:oel="http://schemas.microsoft.com/office/2019/extlst">
           <w:pict>
             <v:line w14:anchorId="6DA7D111" id="Straight Connector 984700384" o:spid="_x0000_s1026" style="position:absolute;z-index:251660293;visibility:visible;mso-wrap-style:square;mso-width-percent:0;mso-height-percent:0;mso-wrap-distance-left:9pt;mso-wrap-distance-top:0;mso-wrap-distance-right:9pt;mso-wrap-distance-bottom:0;mso-position-horizontal:absolute;mso-position-horizontal-relative:margin;mso-position-vertical:absolute;mso-position-vertical-relative:text;mso-width-percent:0;mso-height-percent:0;mso-width-relative:margin;mso-height-relative:margin" from="44.7pt,.75pt" to="468.4pt,.75pt" o:gfxdata="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" strokecolor="windowText" strokeweight="2.5pt">
               <v:stroke joinstyle="miter"/>
@@ -15598,8 +16569,8 @@
 </w:hdr>
 </file>
 
-<file path=word/header4.xml><?xml version="1.0" encoding="utf-8"?>
-<w:hdr xmlns:wpc="http://schemas.microsoft.com/office/word/2010/wordprocessingCanvas" xmlns:cx="http://schemas.microsoft.com/office/drawing/2014/chartex" xmlns:cx1="http://schemas.microsoft.com/office/drawing/2015/9/8/chartex" xmlns:cx2="http://schemas.microsoft.com/office/drawing/2015/10/21/chartex" xmlns:cx3="http://schemas.microsoft.com/office/drawing/2016/5/9/chartex" xmlns:cx4="http://schemas.microsoft.com/office/drawing/2016/5/10/chartex" xmlns:cx5="http://schemas.microsoft.com/office/drawing/2016/5/11/chartex" xmlns:cx6="http://schemas.microsoft.com/office/drawing/2016/5/12/chartex" xmlns:cx7="http://schemas.microsoft.com/office/drawing/2016/5/13/chartex" xmlns:cx8="http://schemas.microsoft.com/office/drawing/2016/5/14/chartex" xmlns:mc="http://schemas.openxmlformats.org/markup-compatibility/2006" xmlns:aink="http://schemas.microsoft.com/office/drawing/2016/ink" xmlns:am3d="http://schemas.microsoft.com/office/drawing/2017/model3d" xmlns:o="urn:schemas-microsoft-com:office:office" xmlns:oel="http://schemas.microsoft.com/office/2019/extlst" xmlns:r="http://schemas.openxmlformats.org/officeDocument/2006/relationships" xmlns:m="http://schemas.openxmlformats.org/officeDocument/2006/math" xmlns:v="urn:schemas-microsoft-com:vml" xmlns:wp14="http://schemas.microsoft.com/office/word/2010/wordprocessingDrawing" xmlns:wp="http://schemas.openxmlformats.org/drawingml/2006/wordprocessingDrawing" xmlns:w10="urn:schemas-microsoft-com:office:word" xmlns:w="http://schemas.openxmlformats.org/wordprocessingml/2006/main" xmlns:w14="http://schemas.microsoft.com/office/word/2010/wordml" xmlns:w15="http://schemas.microsoft.com/office/word/2012/wordml" xmlns:w16cex="http://schemas.microsoft.com/office/word/2018/wordml/cex" xmlns:w16cid="http://schemas.microsoft.com/office/word/2016/wordml/cid" xmlns:w16="http://schemas.microsoft.com/office/word/2018/wordml" xmlns:w16du="http://schemas.microsoft.com/office/word/2023/wordml/word16du" xmlns:w16sdtdh="http://schemas.microsoft.com/office/word/2020/wordml/sdtdatahash" xmlns:w16sdtfl="http://schemas.microsoft.com/office/word/2024/wordml/sdtformatlock" xmlns:w16se="http://schemas.microsoft.com/office/word/2015/wordml/symex" xmlns:wpg="http://schemas.microsoft.com/office/word/2010/wordprocessingGroup" xmlns:wpi="http://schemas.microsoft.com/office/word/2010/wordprocessingInk" xmlns:wne="http://schemas.microsoft.com/office/word/2006/wordml" xmlns:wps="http://schemas.microsoft.com/office/word/2010/wordprocessingShape" mc:Ignorable="w14 w15 w16se w16cid w16 w16cex w16sdtdh w16sdtfl w16du wp14">
+<file path=word/header2.xml><?xml version="1.0" encoding="utf-8"?>
+<w:hdr xmlns:wpc="http://schemas.microsoft.com/office/word/2010/wordprocessingCanvas" xmlns:cx="http://schemas.microsoft.com/office/drawing/2014/chartex" xmlns:cx1="http://schemas.microsoft.com/office/drawing/2015/9/8/chartex" xmlns:cx2="http://schemas.microsoft.com/office/drawing/2015/10/21/chartex" xmlns:cx3="http://schemas.microsoft.com/office/drawing/2016/5/9/chartex" xmlns:cx4="http://schemas.microsoft.com/office/drawing/2016/5/10/chartex" xmlns:cx5="http://schemas.microsoft.com/office/drawing/2016/5/11/chartex" xmlns:cx6="http://schemas.microsoft.com/office/drawing/2016/5/12/chartex" xmlns:cx7="http://schemas.microsoft.com/office/drawing/2016/5/13/chartex" xmlns:cx8="http://schemas.microsoft.com/office/drawing/2016/5/14/chartex" xmlns:mc="http://schemas.openxmlformats.org/markup-compatibility/2006" xmlns:aink="http://schemas.microsoft.com/office/drawing/2016/ink" xmlns:am3d="http://schemas.microsoft.com/office/drawing/2017/model3d" xmlns:o="urn:schemas-microsoft-com:office:office" xmlns:r="http://schemas.openxmlformats.org/officeDocument/2006/relationships" xmlns:m="http://schemas.openxmlformats.org/officeDocument/2006/math" xmlns:v="urn:schemas-microsoft-com:vml" xmlns:wp14="http://schemas.microsoft.com/office/word/2010/wordprocessingDrawing" xmlns:wp="http://schemas.openxmlformats.org/drawingml/2006/wordprocessingDrawing" xmlns:w10="urn:schemas-microsoft-com:office:word" xmlns:w="http://schemas.openxmlformats.org/wordprocessingml/2006/main" xmlns:w14="http://schemas.microsoft.com/office/word/2010/wordml" xmlns:w15="http://schemas.microsoft.com/office/word/2012/wordml" xmlns:w16cex="http://schemas.microsoft.com/office/word/2018/wordml/cex" xmlns:w16cid="http://schemas.microsoft.com/office/word/2016/wordml/cid" xmlns:w16="http://schemas.microsoft.com/office/word/2018/wordml" xmlns:w16sdtdh="http://schemas.microsoft.com/office/word/2020/wordml/sdtdatahash" xmlns:w16se="http://schemas.microsoft.com/office/word/2015/wordml/symex" xmlns:wpg="http://schemas.microsoft.com/office/word/2010/wordprocessingGroup" xmlns:wpi="http://schemas.microsoft.com/office/word/2010/wordprocessingInk" xmlns:wne="http://schemas.microsoft.com/office/word/2006/wordml" xmlns:wps="http://schemas.microsoft.com/office/word/2010/wordprocessingShape" mc:Ignorable="w14 w15 w16se w16cid w16 w16cex w16sdtdh wp14">
   <w:p>
     <w:pPr>
       <w:widowControl w:val="0"/>
@@ -15897,7 +16868,7 @@
             </wp:anchor>
           </w:drawing>
         </mc:Choice>
-        <mc:Fallback xmlns:arto="http://schemas.microsoft.com/office/word/2006/arto">
+        <mc:Fallback xmlns:arto="http://schemas.microsoft.com/office/word/2006/arto" xmlns:w16sdtfl="http://schemas.microsoft.com/office/word/2024/wordml/sdtformatlock" xmlns:w16du="http://schemas.microsoft.com/office/word/2023/wordml/word16du" xmlns:oel="http://schemas.microsoft.com/office/2019/extlst">
           <w:pict>
             <v:line w14:anchorId="3A3864D8" id="Straight Connector 1781483498" o:spid="_x0000_s1026" style="position:absolute;z-index:251658245;visibility:visible;mso-wrap-style:square;mso-width-percent:0;mso-height-percent:0;mso-wrap-distance-left:9pt;mso-wrap-distance-top:0;mso-wrap-distance-right:9pt;mso-wrap-distance-bottom:0;mso-position-horizontal:absolute;mso-position-horizontal-relative:margin;mso-position-vertical:absolute;mso-position-vertical-relative:text;mso-width-percent:0;mso-height-percent:0;mso-width-relative:margin;mso-height-relative:margin" from="44.7pt,2.1pt" to="468.4pt,2.1pt" o:gfxdata="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" strokecolor="windowText" strokeweight="2.5pt">
               <v:stroke joinstyle="miter"/>
@@ -15911,8 +16882,8 @@
 </w:hdr>
 </file>
 
-<file path=word/header5.xml><?xml version="1.0" encoding="utf-8"?>
-<w:hdr xmlns:wpc="http://schemas.microsoft.com/office/word/2010/wordprocessingCanvas" xmlns:cx="http://schemas.microsoft.com/office/drawing/2014/chartex" xmlns:cx1="http://schemas.microsoft.com/office/drawing/2015/9/8/chartex" xmlns:cx2="http://schemas.microsoft.com/office/drawing/2015/10/21/chartex" xmlns:cx3="http://schemas.microsoft.com/office/drawing/2016/5/9/chartex" xmlns:cx4="http://schemas.microsoft.com/office/drawing/2016/5/10/chartex" xmlns:cx5="http://schemas.microsoft.com/office/drawing/2016/5/11/chartex" xmlns:cx6="http://schemas.microsoft.com/office/drawing/2016/5/12/chartex" xmlns:cx7="http://schemas.microsoft.com/office/drawing/2016/5/13/chartex" xmlns:cx8="http://schemas.microsoft.com/office/drawing/2016/5/14/chartex" xmlns:mc="http://schemas.openxmlformats.org/markup-compatibility/2006" xmlns:aink="http://schemas.microsoft.com/office/drawing/2016/ink" xmlns:am3d="http://schemas.microsoft.com/office/drawing/2017/model3d" xmlns:o="urn:schemas-microsoft-com:office:office" xmlns:oel="http://schemas.microsoft.com/office/2019/extlst" xmlns:r="http://schemas.openxmlformats.org/officeDocument/2006/relationships" xmlns:m="http://schemas.openxmlformats.org/officeDocument/2006/math" xmlns:v="urn:schemas-microsoft-com:vml" xmlns:wp14="http://schemas.microsoft.com/office/word/2010/wordprocessingDrawing" xmlns:wp="http://schemas.openxmlformats.org/drawingml/2006/wordprocessingDrawing" xmlns:w10="urn:schemas-microsoft-com:office:word" xmlns:w="http://schemas.openxmlformats.org/wordprocessingml/2006/main" xmlns:w14="http://schemas.microsoft.com/office/word/2010/wordml" xmlns:w15="http://schemas.microsoft.com/office/word/2012/wordml" xmlns:w16cex="http://schemas.microsoft.com/office/word/2018/wordml/cex" xmlns:w16cid="http://schemas.microsoft.com/office/word/2016/wordml/cid" xmlns:w16="http://schemas.microsoft.com/office/word/2018/wordml" xmlns:w16du="http://schemas.microsoft.com/office/word/2023/wordml/word16du" xmlns:w16sdtdh="http://schemas.microsoft.com/office/word/2020/wordml/sdtdatahash" xmlns:w16sdtfl="http://schemas.microsoft.com/office/word/2024/wordml/sdtformatlock" xmlns:w16se="http://schemas.microsoft.com/office/word/2015/wordml/symex" xmlns:wpg="http://schemas.microsoft.com/office/word/2010/wordprocessingGroup" xmlns:wpi="http://schemas.microsoft.com/office/word/2010/wordprocessingInk" xmlns:wne="http://schemas.microsoft.com/office/word/2006/wordml" xmlns:wps="http://schemas.microsoft.com/office/word/2010/wordprocessingShape" mc:Ignorable="w14 w15 w16se w16cid w16 w16cex w16sdtdh w16sdtfl w16du wp14">
+<file path=word/header3.xml><?xml version="1.0" encoding="utf-8"?>
+<w:hdr xmlns:wpc="http://schemas.microsoft.com/office/word/2010/wordprocessingCanvas" xmlns:cx="http://schemas.microsoft.com/office/drawing/2014/chartex" xmlns:cx1="http://schemas.microsoft.com/office/drawing/2015/9/8/chartex" xmlns:cx2="http://schemas.microsoft.com/office/drawing/2015/10/21/chartex" xmlns:cx3="http://schemas.microsoft.com/office/drawing/2016/5/9/chartex" xmlns:cx4="http://schemas.microsoft.com/office/drawing/2016/5/10/chartex" xmlns:cx5="http://schemas.microsoft.com/office/drawing/2016/5/11/chartex" xmlns:cx6="http://schemas.microsoft.com/office/drawing/2016/5/12/chartex" xmlns:cx7="http://schemas.microsoft.com/office/drawing/2016/5/13/chartex" xmlns:cx8="http://schemas.microsoft.com/office/drawing/2016/5/14/chartex" xmlns:mc="http://schemas.openxmlformats.org/markup-compatibility/2006" xmlns:aink="http://schemas.microsoft.com/office/drawing/2016/ink" xmlns:am3d="http://schemas.microsoft.com/office/drawing/2017/model3d" xmlns:o="urn:schemas-microsoft-com:office:office" xmlns:r="http://schemas.openxmlformats.org/officeDocument/2006/relationships" xmlns:m="http://schemas.openxmlformats.org/officeDocument/2006/math" xmlns:v="urn:schemas-microsoft-com:vml" xmlns:wp14="http://schemas.microsoft.com/office/word/2010/wordprocessingDrawing" xmlns:wp="http://schemas.openxmlformats.org/drawingml/2006/wordprocessingDrawing" xmlns:w10="urn:schemas-microsoft-com:office:word" xmlns:w="http://schemas.openxmlformats.org/wordprocessingml/2006/main" xmlns:w14="http://schemas.microsoft.com/office/word/2010/wordml" xmlns:w15="http://schemas.microsoft.com/office/word/2012/wordml" xmlns:w16cex="http://schemas.microsoft.com/office/word/2018/wordml/cex" xmlns:w16cid="http://schemas.microsoft.com/office/word/2016/wordml/cid" xmlns:w16="http://schemas.microsoft.com/office/word/2018/wordml" xmlns:w16sdtdh="http://schemas.microsoft.com/office/word/2020/wordml/sdtdatahash" xmlns:w16se="http://schemas.microsoft.com/office/word/2015/wordml/symex" xmlns:wpg="http://schemas.microsoft.com/office/word/2010/wordprocessingGroup" xmlns:wpi="http://schemas.microsoft.com/office/word/2010/wordprocessingInk" xmlns:wne="http://schemas.microsoft.com/office/word/2006/wordml" xmlns:wps="http://schemas.microsoft.com/office/word/2010/wordprocessingShape" mc:Ignorable="w14 w15 w16se w16cid w16 w16cex w16sdtdh wp14">
   <w:p>
     <w:pPr>
       <w:widowControl w:val="0"/>
@@ -16210,7 +17181,7 @@
             </wp:anchor>
           </w:drawing>
         </mc:Choice>
-        <mc:Fallback xmlns:arto="http://schemas.microsoft.com/office/word/2006/arto">
+        <mc:Fallback xmlns:arto="http://schemas.microsoft.com/office/word/2006/arto" xmlns:w16sdtfl="http://schemas.microsoft.com/office/word/2024/wordml/sdtformatlock" xmlns:w16du="http://schemas.microsoft.com/office/word/2023/wordml/word16du" xmlns:oel="http://schemas.microsoft.com/office/2019/extlst">
           <w:pict>
             <v:line w14:anchorId="48106103" id="Straight Connector 623546222" o:spid="_x0000_s1026" style="position:absolute;z-index:251658247;visibility:visible;mso-wrap-style:square;mso-width-percent:0;mso-height-percent:0;mso-wrap-distance-left:9pt;mso-wrap-distance-top:0;mso-wrap-distance-right:9pt;mso-wrap-distance-bottom:0;mso-position-horizontal:absolute;mso-position-horizontal-relative:margin;mso-position-vertical:absolute;mso-position-vertical-relative:text;mso-width-percent:0;mso-height-percent:0;mso-width-relative:margin;mso-height-relative:margin" from="44.7pt,2.1pt" to="468.4pt,2.1pt" o:gfxdata="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" strokecolor="windowText" strokeweight="2.5pt">
               <v:stroke joinstyle="miter"/>
@@ -16225,7 +17196,7 @@
 </file>
 
 <file path=word/numbering.xml><?xml version="1.0" encoding="utf-8"?>
-<w:numbering xmlns:wpc="http://schemas.microsoft.com/office/word/2010/wordprocessingCanvas" xmlns:cx="http://schemas.microsoft.com/office/drawing/2014/chartex" xmlns:cx1="http://schemas.microsoft.com/office/drawing/2015/9/8/chartex" xmlns:cx2="http://schemas.microsoft.com/office/drawing/2015/10/21/chartex" xmlns:cx3="http://schemas.microsoft.com/office/drawing/2016/5/9/chartex" xmlns:cx4="http://schemas.microsoft.com/office/drawing/2016/5/10/chartex" xmlns:cx5="http://schemas.microsoft.com/office/drawing/2016/5/11/chartex" xmlns:cx6="http://schemas.microsoft.com/office/drawing/2016/5/12/chartex" xmlns:cx7="http://schemas.microsoft.com/office/drawing/2016/5/13/chartex" xmlns:cx8="http://schemas.microsoft.com/office/drawing/2016/5/14/chartex" xmlns:mc="http://schemas.openxmlformats.org/markup-compatibility/2006" xmlns:aink="http://schemas.microsoft.com/office/drawing/2016/ink" xmlns:am3d="http://schemas.microsoft.com/office/drawing/2017/model3d" xmlns:o="urn:schemas-microsoft-com:office:office" xmlns:oel="http://schemas.microsoft.com/office/2019/extlst" xmlns:r="http://schemas.openxmlformats.org/officeDocument/2006/relationships" xmlns:m="http://schemas.openxmlformats.org/officeDocument/2006/math" xmlns:v="urn:schemas-microsoft-com:vml" xmlns:wp14="http://schemas.microsoft.com/office/word/2010/wordprocessingDrawing" xmlns:wp="http://schemas.openxmlformats.org/drawingml/2006/wordprocessingDrawing" xmlns:w10="urn:schemas-microsoft-com:office:word" xmlns:w="http://schemas.openxmlformats.org/wordprocessingml/2006/main" xmlns:w14="http://schemas.microsoft.com/office/word/2010/wordml" xmlns:w15="http://schemas.microsoft.com/office/word/2012/wordml" xmlns:w16cex="http://schemas.microsoft.com/office/word/2018/wordml/cex" xmlns:w16cid="http://schemas.microsoft.com/office/word/2016/wordml/cid" xmlns:w16="http://schemas.microsoft.com/office/word/2018/wordml" xmlns:w16du="http://schemas.microsoft.com/office/word/2023/wordml/word16du" xmlns:w16sdtdh="http://schemas.microsoft.com/office/word/2020/wordml/sdtdatahash" xmlns:w16sdtfl="http://schemas.microsoft.com/office/word/2024/wordml/sdtformatlock" xmlns:w16se="http://schemas.microsoft.com/office/word/2015/wordml/symex" xmlns:wpg="http://schemas.microsoft.com/office/word/2010/wordprocessingGroup" xmlns:wpi="http://schemas.microsoft.com/office/word/2010/wordprocessingInk" xmlns:wne="http://schemas.microsoft.com/office/word/2006/wordml" xmlns:wps="http://schemas.microsoft.com/office/word/2010/wordprocessingShape" mc:Ignorable="w14 w15 w16se w16cid w16 w16cex w16sdtdh w16sdtfl w16du wp14">
+<w:numbering xmlns:wpc="http://schemas.microsoft.com/office/word/2010/wordprocessingCanvas" xmlns:cx="http://schemas.microsoft.com/office/drawing/2014/chartex" xmlns:cx1="http://schemas.microsoft.com/office/drawing/2015/9/8/chartex" xmlns:cx2="http://schemas.microsoft.com/office/drawing/2015/10/21/chartex" xmlns:cx3="http://schemas.microsoft.com/office/drawing/2016/5/9/chartex" xmlns:cx4="http://schemas.microsoft.com/office/drawing/2016/5/10/chartex" xmlns:cx5="http://schemas.microsoft.com/office/drawing/2016/5/11/chartex" xmlns:cx6="http://schemas.microsoft.com/office/drawing/2016/5/12/chartex" xmlns:cx7="http://schemas.microsoft.com/office/drawing/2016/5/13/chartex" xmlns:cx8="http://schemas.microsoft.com/office/drawing/2016/5/14/chartex" xmlns:mc="http://schemas.openxmlformats.org/markup-compatibility/2006" xmlns:aink="http://schemas.microsoft.com/office/drawing/2016/ink" xmlns:am3d="http://schemas.microsoft.com/office/drawing/2017/model3d" xmlns:o="urn:schemas-microsoft-com:office:office" xmlns:r="http://schemas.openxmlformats.org/officeDocument/2006/relationships" xmlns:m="http://schemas.openxmlformats.org/officeDocument/2006/math" xmlns:v="urn:schemas-microsoft-com:vml" xmlns:wp14="http://schemas.microsoft.com/office/word/2010/wordprocessingDrawing" xmlns:wp="http://schemas.openxmlformats.org/drawingml/2006/wordprocessingDrawing" xmlns:w10="urn:schemas-microsoft-com:office:word" xmlns:w="http://schemas.openxmlformats.org/wordprocessingml/2006/main" xmlns:w14="http://schemas.microsoft.com/office/word/2010/wordml" xmlns:w15="http://schemas.microsoft.com/office/word/2012/wordml" xmlns:w16cex="http://schemas.microsoft.com/office/word/2018/wordml/cex" xmlns:w16cid="http://schemas.microsoft.com/office/word/2016/wordml/cid" xmlns:w16="http://schemas.microsoft.com/office/word/2018/wordml" xmlns:w16sdtdh="http://schemas.microsoft.com/office/word/2020/wordml/sdtdatahash" xmlns:w16se="http://schemas.microsoft.com/office/word/2015/wordml/symex" xmlns:wpg="http://schemas.microsoft.com/office/word/2010/wordprocessingGroup" xmlns:wpi="http://schemas.microsoft.com/office/word/2010/wordprocessingInk" xmlns:wne="http://schemas.microsoft.com/office/word/2006/wordml" xmlns:wps="http://schemas.microsoft.com/office/word/2010/wordprocessingShape" mc:Ignorable="w14 w15 w16se w16cid w16 w16cex w16sdtdh wp14">
   <w:abstractNum w:abstractNumId="0" w15:restartNumberingAfterBreak="0">
     <w:nsid w:val="FFFFFF88"/>
     <w:multiLevelType w:val="singleLevel"/>
@@ -17609,19 +18580,19 @@
       </w:pPr>
     </w:lvl>
   </w:abstractNum>
-  <w:num w:numId="1" w16cid:durableId="961035549">
+  <w:num w:numId="1">
     <w:abstractNumId w:val="8"/>
   </w:num>
-  <w:num w:numId="2" w16cid:durableId="1153792761">
+  <w:num w:numId="2">
     <w:abstractNumId w:val="11"/>
   </w:num>
-  <w:num w:numId="3" w16cid:durableId="1329947307">
+  <w:num w:numId="3">
     <w:abstractNumId w:val="12"/>
   </w:num>
-  <w:num w:numId="4" w16cid:durableId="1330252992">
+  <w:num w:numId="4">
     <w:abstractNumId w:val="0"/>
   </w:num>
-  <w:num w:numId="5" w16cid:durableId="1045830388">
+  <w:num w:numId="5">
     <w:abstractNumId w:val="13"/>
     <w:lvlOverride w:ilvl="0">
       <w:startOverride w:val="1"/>
@@ -17651,13 +18622,13 @@
       <w:startOverride w:val="1"/>
     </w:lvlOverride>
   </w:num>
-  <w:num w:numId="6" w16cid:durableId="66152856">
+  <w:num w:numId="6">
     <w:abstractNumId w:val="4"/>
   </w:num>
-  <w:num w:numId="7" w16cid:durableId="1455249691">
+  <w:num w:numId="7">
     <w:abstractNumId w:val="10"/>
   </w:num>
-  <w:num w:numId="8" w16cid:durableId="752747497">
+  <w:num w:numId="8">
     <w:abstractNumId w:val="8"/>
     <w:lvlOverride w:ilvl="0">
       <w:startOverride w:val="1"/>
@@ -17687,31 +18658,31 @@
       <w:startOverride w:val="1"/>
     </w:lvlOverride>
   </w:num>
-  <w:num w:numId="9" w16cid:durableId="1507864367">
+  <w:num w:numId="9">
     <w:abstractNumId w:val="1"/>
   </w:num>
-  <w:num w:numId="10" w16cid:durableId="1172641401">
+  <w:num w:numId="10">
     <w:abstractNumId w:val="3"/>
   </w:num>
-  <w:num w:numId="11" w16cid:durableId="1649162667">
+  <w:num w:numId="11">
     <w:abstractNumId w:val="14"/>
   </w:num>
-  <w:num w:numId="12" w16cid:durableId="286588943">
+  <w:num w:numId="12">
     <w:abstractNumId w:val="15"/>
   </w:num>
-  <w:num w:numId="13" w16cid:durableId="1983919916">
+  <w:num w:numId="13">
     <w:abstractNumId w:val="9"/>
   </w:num>
-  <w:num w:numId="14" w16cid:durableId="1479036706">
+  <w:num w:numId="14">
     <w:abstractNumId w:val="5"/>
   </w:num>
-  <w:num w:numId="15" w16cid:durableId="149835030">
+  <w:num w:numId="15">
     <w:abstractNumId w:val="7"/>
   </w:num>
-  <w:num w:numId="16" w16cid:durableId="1852834576">
+  <w:num w:numId="16">
     <w:abstractNumId w:val="6"/>
   </w:num>
-  <w:num w:numId="17" w16cid:durableId="1833712922">
+  <w:num w:numId="17">
     <w:abstractNumId w:val="2"/>
   </w:num>
   <w:numIdMacAtCleanup w:val="12"/>
@@ -17719,7 +18690,7 @@
 </file>
 
 <file path=word/styles.xml><?xml version="1.0" encoding="utf-8"?>
-<w:styles xmlns:mc="http://schemas.openxmlformats.org/markup-compatibility/2006" xmlns:r="http://schemas.openxmlformats.org/officeDocument/2006/relationships" xmlns:w="http://schemas.openxmlformats.org/wordprocessingml/2006/main" xmlns:w14="http://schemas.microsoft.com/office/word/2010/wordml" xmlns:w15="http://schemas.microsoft.com/office/word/2012/wordml" xmlns:w16cex="http://schemas.microsoft.com/office/word/2018/wordml/cex" xmlns:w16cid="http://schemas.microsoft.com/office/word/2016/wordml/cid" xmlns:w16="http://schemas.microsoft.com/office/word/2018/wordml" xmlns:w16du="http://schemas.microsoft.com/office/word/2023/wordml/word16du" xmlns:w16sdtdh="http://schemas.microsoft.com/office/word/2020/wordml/sdtdatahash" xmlns:w16sdtfl="http://schemas.microsoft.com/office/word/2024/wordml/sdtformatlock" xmlns:w16se="http://schemas.microsoft.com/office/word/2015/wordml/symex" mc:Ignorable="w14 w15 w16se w16cid w16 w16cex w16sdtdh w16sdtfl w16du">
+<w:styles xmlns:mc="http://schemas.openxmlformats.org/markup-compatibility/2006" xmlns:r="http://schemas.openxmlformats.org/officeDocument/2006/relationships" xmlns:w="http://schemas.openxmlformats.org/wordprocessingml/2006/main" xmlns:w14="http://schemas.microsoft.com/office/word/2010/wordml" xmlns:w15="http://schemas.microsoft.com/office/word/2012/wordml" xmlns:w16cex="http://schemas.microsoft.com/office/word/2018/wordml/cex" xmlns:w16cid="http://schemas.microsoft.com/office/word/2016/wordml/cid" xmlns:w16="http://schemas.microsoft.com/office/word/2018/wordml" xmlns:w16sdtdh="http://schemas.microsoft.com/office/word/2020/wordml/sdtdatahash" xmlns:w16se="http://schemas.microsoft.com/office/word/2015/wordml/symex" mc:Ignorable="w14 w15 w16se w16cid w16 w16cex w16sdtdh">
   <w:docDefaults>
     <w:rPrDefault>
       <w:rPr>
@@ -19221,7 +20192,12 @@
 </file>
 
 <file path=customXml/item2.xml><?xml version="1.0" encoding="utf-8"?>
-<b:Sources xmlns:b="http://schemas.openxmlformats.org/officeDocument/2006/bibliography" xmlns="http://schemas.openxmlformats.org/officeDocument/2006/bibliography" SelectedStyle="\APASixthEditionOfficeOnline.xsl" StyleName="APA" Version="6"/>
+<?mso-contentType ?>
+<FormTemplates xmlns="http://schemas.microsoft.com/sharepoint/v3/contenttype/forms">
+  <Display>DocumentLibraryForm</Display>
+  <Edit>DocumentLibraryForm</Edit>
+  <New>DocumentLibraryForm</New>
+</FormTemplates>
 </file>
 
 <file path=customXml/item3.xml><?xml version="1.0" encoding="utf-8"?>
@@ -19468,12 +20444,7 @@
 </file>
 
 <file path=customXml/item4.xml><?xml version="1.0" encoding="utf-8"?>
-<?mso-contentType ?>
-<FormTemplates xmlns="http://schemas.microsoft.com/sharepoint/v3/contenttype/forms">
-  <Display>DocumentLibraryForm</Display>
-  <Edit>DocumentLibraryForm</Edit>
-  <New>DocumentLibraryForm</New>
-</FormTemplates>
+<b:Sources xmlns:b="http://schemas.openxmlformats.org/officeDocument/2006/bibliography" xmlns="http://schemas.openxmlformats.org/officeDocument/2006/bibliography" SelectedStyle="\APASixthEditionOfficeOnline.xsl" StyleName="APA" Version="6"/>
 </file>
 
 <file path=customXml/itemProps1.xml><?xml version="1.0" encoding="utf-8"?>
@@ -19488,9 +20459,9 @@
 </file>
 
 <file path=customXml/itemProps2.xml><?xml version="1.0" encoding="utf-8"?>
-<ds:datastoreItem xmlns:ds="http://schemas.openxmlformats.org/officeDocument/2006/customXml" ds:itemID="{10D35394-9BBA-4CA7-9ACA-93FF9FC4B9FE}">
+<ds:datastoreItem xmlns:ds="http://schemas.openxmlformats.org/officeDocument/2006/customXml" ds:itemID="{ADE80AD1-B511-437D-9EC6-E71B406ED00D}">
   <ds:schemaRefs>
-    <ds:schemaRef ds:uri="http://schemas.openxmlformats.org/officeDocument/2006/bibliography"/>
+    <ds:schemaRef ds:uri="http://schemas.microsoft.com/sharepoint/v3/contenttype/forms"/>
   </ds:schemaRefs>
 </ds:datastoreItem>
 </file>
@@ -19515,9 +20486,9 @@
 </file>
 
 <file path=customXml/itemProps4.xml><?xml version="1.0" encoding="utf-8"?>
-<ds:datastoreItem xmlns:ds="http://schemas.openxmlformats.org/officeDocument/2006/customXml" ds:itemID="{ADE80AD1-B511-437D-9EC6-E71B406ED00D}">
+<ds:datastoreItem xmlns:ds="http://schemas.openxmlformats.org/officeDocument/2006/customXml" ds:itemID="{10D35394-9BBA-4CA7-9ACA-93FF9FC4B9FE}">
   <ds:schemaRefs>
-    <ds:schemaRef ds:uri="http://schemas.microsoft.com/sharepoint/v3/contenttype/forms"/>
+    <ds:schemaRef ds:uri="http://schemas.openxmlformats.org/officeDocument/2006/bibliography"/>
   </ds:schemaRefs>
 </ds:datastoreItem>
 </file>
</xml_diff>